<commit_message>
feat: add profession-scoped DST evidence filtering with vacancy-based inference
- Add PROFESSION_SCOPE SQL clause to ExpertOpinionRepository and ForesightRepository to filter evidence by profession_code
- Implement vacancy-based inference: when profession_code is null/empty, infer applicability through vacancy_skills → vacancy_profession → profession chain at canonical/work_skill/family/domain levels
- Use EXISTS subqueries to prevent opinion/foresight duplication from multiple matching vac
</commit_message>
<xml_diff>
--- a/text/article/Статья Александров DST.docx
+++ b/text/article/Статья Александров DST.docx
@@ -1,10 +1,10 @@
 
 <file path=word/document.xml><?xml version="1.0" encoding="utf-8"?>
-<w:document xmlns:wpc="http://schemas.microsoft.com/office/word/2010/wordprocessingCanvas" xmlns:cx="http://schemas.microsoft.com/office/drawing/2014/chartex" xmlns:cx1="http://schemas.microsoft.com/office/drawing/2015/9/8/chartex" xmlns:cx2="http://schemas.microsoft.com/office/drawing/2015/10/21/chartex" xmlns:cx3="http://schemas.microsoft.com/office/drawing/2016/5/9/chartex" xmlns:cx4="http://schemas.microsoft.com/office/drawing/2016/5/10/chartex" xmlns:cx5="http://schemas.microsoft.com/office/drawing/2016/5/11/chartex" xmlns:cx6="http://schemas.microsoft.com/office/drawing/2016/5/12/chartex" xmlns:cx7="http://schemas.microsoft.com/office/drawing/2016/5/13/chartex" xmlns:cx8="http://schemas.microsoft.com/office/drawing/2016/5/14/chartex" xmlns:mc="http://schemas.openxmlformats.org/markup-compatibility/2006" xmlns:aink="http://schemas.microsoft.com/office/drawing/2016/ink" xmlns:am3d="http://schemas.microsoft.com/office/drawing/2017/model3d" xmlns:o="urn:schemas-microsoft-com:office:office" xmlns:r="http://schemas.openxmlformats.org/officeDocument/2006/relationships" xmlns:m="http://schemas.openxmlformats.org/officeDocument/2006/math" xmlns:v="urn:schemas-microsoft-com:vml" xmlns:wp14="http://schemas.microsoft.com/office/word/2010/wordprocessingDrawing" xmlns:wp="http://schemas.openxmlformats.org/drawingml/2006/wordprocessingDrawing" xmlns:w10="urn:schemas-microsoft-com:office:word" xmlns:w="http://schemas.openxmlformats.org/wordprocessingml/2006/main" xmlns:w14="http://schemas.microsoft.com/office/word/2010/wordml" xmlns:w15="http://schemas.microsoft.com/office/word/2012/wordml" xmlns:w16cex="http://schemas.microsoft.com/office/word/2018/wordml/cex" xmlns:w16cid="http://schemas.microsoft.com/office/word/2016/wordml/cid" xmlns:w16="http://schemas.microsoft.com/office/word/2018/wordml" xmlns:w16se="http://schemas.microsoft.com/office/word/2015/wordml/symex" xmlns:wpg="http://schemas.microsoft.com/office/word/2010/wordprocessingGroup" xmlns:wpi="http://schemas.microsoft.com/office/word/2010/wordprocessingInk" xmlns:wne="http://schemas.microsoft.com/office/word/2006/wordml" xmlns:wps="http://schemas.microsoft.com/office/word/2010/wordprocessingShape" mc:Ignorable="w14 w15 w16se w16cid w16 w16cex wp14">
+<w:document xmlns:wpc="http://schemas.microsoft.com/office/word/2010/wordprocessingCanvas" xmlns:cx="http://schemas.microsoft.com/office/drawing/2014/chartex" xmlns:cx1="http://schemas.microsoft.com/office/drawing/2015/9/8/chartex" xmlns:cx2="http://schemas.microsoft.com/office/drawing/2015/10/21/chartex" xmlns:cx3="http://schemas.microsoft.com/office/drawing/2016/5/9/chartex" xmlns:cx4="http://schemas.microsoft.com/office/drawing/2016/5/10/chartex" xmlns:cx5="http://schemas.microsoft.com/office/drawing/2016/5/11/chartex" xmlns:cx6="http://schemas.microsoft.com/office/drawing/2016/5/12/chartex" xmlns:cx7="http://schemas.microsoft.com/office/drawing/2016/5/13/chartex" xmlns:cx8="http://schemas.microsoft.com/office/drawing/2016/5/14/chartex" xmlns:mc="http://schemas.openxmlformats.org/markup-compatibility/2006" xmlns:aink="http://schemas.microsoft.com/office/drawing/2016/ink" xmlns:am3d="http://schemas.microsoft.com/office/drawing/2017/model3d" xmlns:o="urn:schemas-microsoft-com:office:office" xmlns:oel="http://schemas.microsoft.com/office/2019/extlst" xmlns:r="http://schemas.openxmlformats.org/officeDocument/2006/relationships" xmlns:m="http://schemas.openxmlformats.org/officeDocument/2006/math" xmlns:v="urn:schemas-microsoft-com:vml" xmlns:wp14="http://schemas.microsoft.com/office/word/2010/wordprocessingDrawing" xmlns:wp="http://schemas.openxmlformats.org/drawingml/2006/wordprocessingDrawing" xmlns:w10="urn:schemas-microsoft-com:office:word" xmlns:w="http://schemas.openxmlformats.org/wordprocessingml/2006/main" xmlns:w14="http://schemas.microsoft.com/office/word/2010/wordml" xmlns:w15="http://schemas.microsoft.com/office/word/2012/wordml" xmlns:w16cex="http://schemas.microsoft.com/office/word/2018/wordml/cex" xmlns:w16cid="http://schemas.microsoft.com/office/word/2016/wordml/cid" xmlns:w16="http://schemas.microsoft.com/office/word/2018/wordml" xmlns:w16du="http://schemas.microsoft.com/office/word/2023/wordml/word16du" xmlns:w16sdtdh="http://schemas.microsoft.com/office/word/2020/wordml/sdtdatahash" xmlns:w16sdtfl="http://schemas.microsoft.com/office/word/2024/wordml/sdtformatlock" xmlns:w16se="http://schemas.microsoft.com/office/word/2015/wordml/symex" xmlns:wpg="http://schemas.microsoft.com/office/word/2010/wordprocessingGroup" xmlns:wpi="http://schemas.microsoft.com/office/word/2010/wordprocessingInk" xmlns:wne="http://schemas.microsoft.com/office/word/2006/wordml" xmlns:wps="http://schemas.microsoft.com/office/word/2010/wordprocessingShape" mc:Ignorable="w14 w15 w16se w16cid w16 w16cex w16sdtdh w16sdtfl w16du wp14">
   <w:body>
     <w:p>
       <w:pPr>
-        <w:spacing w:after="240"/>
+        <w:spacing w:after="240" w:line="276" w:lineRule="auto"/>
         <w:jc w:val="center"/>
         <w:rPr>
           <w:b/>
@@ -18,44 +18,16 @@
           <w:sz w:val="32"/>
           <w:szCs w:val="32"/>
         </w:rPr>
-        <w:t xml:space="preserve">Система поддержки принятия решений для </w:t>
-      </w:r>
-      <w:proofErr w:type="spellStart"/>
-      <w:r>
-        <w:rPr>
-          <w:b/>
-          <w:sz w:val="32"/>
-          <w:szCs w:val="32"/>
-        </w:rPr>
-        <w:t>проактивного</w:t>
-      </w:r>
-      <w:proofErr w:type="spellEnd"/>
-      <w:r>
-        <w:rPr>
-          <w:b/>
-          <w:sz w:val="32"/>
-          <w:szCs w:val="32"/>
-        </w:rPr>
-        <w:t xml:space="preserve"> обновления образовательных программ п</w:t>
-      </w:r>
-      <w:bookmarkStart w:id="0" w:name="_GoBack"/>
-      <w:bookmarkEnd w:id="0"/>
-      <w:r>
-        <w:rPr>
-          <w:b/>
-          <w:sz w:val="32"/>
-          <w:szCs w:val="32"/>
-        </w:rPr>
-        <w:t>о данным рынка труда</w:t>
+        <w:t>Система поддержки принятия решений для проактивного обновления образовательных программ по данным рынка труда</w:t>
       </w:r>
     </w:p>
     <w:p>
       <w:pPr>
+        <w:spacing w:line="276" w:lineRule="auto"/>
         <w:jc w:val="center"/>
         <w:rPr>
           <w:b/>
           <w:i/>
-          <w:sz w:val="24"/>
           <w:szCs w:val="24"/>
         </w:rPr>
       </w:pPr>
@@ -63,7 +35,6 @@
         <w:rPr>
           <w:b/>
           <w:i/>
-          <w:sz w:val="24"/>
           <w:szCs w:val="24"/>
         </w:rPr>
         <w:t>А. С. Александров</w:t>
@@ -72,7 +43,6 @@
         <w:rPr>
           <w:b/>
           <w:i/>
-          <w:sz w:val="24"/>
           <w:szCs w:val="24"/>
           <w:vertAlign w:val="superscript"/>
         </w:rPr>
@@ -82,7 +52,6 @@
         <w:rPr>
           <w:b/>
           <w:i/>
-          <w:sz w:val="24"/>
           <w:szCs w:val="24"/>
         </w:rPr>
         <w:t>, В. М. Зарипова</w:t>
@@ -91,7 +60,6 @@
         <w:rPr>
           <w:b/>
           <w:i/>
-          <w:sz w:val="24"/>
           <w:szCs w:val="24"/>
           <w:vertAlign w:val="superscript"/>
         </w:rPr>
@@ -100,6 +68,7 @@
     </w:p>
     <w:p>
       <w:pPr>
+        <w:spacing w:line="276" w:lineRule="auto"/>
         <w:jc w:val="center"/>
         <w:rPr>
           <w:i/>
@@ -138,7 +107,7 @@
     </w:p>
     <w:p>
       <w:pPr>
-        <w:spacing w:after="240"/>
+        <w:spacing w:after="240" w:line="276" w:lineRule="auto"/>
         <w:jc w:val="center"/>
         <w:rPr>
           <w:i/>
@@ -177,6 +146,7 @@
     </w:p>
     <w:p>
       <w:pPr>
+        <w:spacing w:line="276" w:lineRule="auto"/>
         <w:rPr>
           <w:i/>
         </w:rPr>
@@ -201,89 +171,55 @@
         <w:rPr>
           <w:i/>
         </w:rPr>
-        <w:t xml:space="preserve">В настоящее время перед образовательными организациями в области инженерно-технических и ИТ-направлений достаточно остро стоит задача </w:t>
+        <w:t xml:space="preserve">В настоящее время перед образовательными организациями в области инженерно-технических и ИТ-направлений достаточно остро стоит задача проактивного обновления образовательных программ в условиях быстро изменяющегося рынка труда. В данной статье предложена система поддержки принятия решений (СППР), основанная на теории свидетельств </w:t>
       </w:r>
       <w:proofErr w:type="spellStart"/>
       <w:r>
         <w:rPr>
           <w:i/>
         </w:rPr>
-        <w:t>проактивного</w:t>
+        <w:t>Демпстера</w:t>
       </w:r>
       <w:proofErr w:type="spellEnd"/>
       <w:r>
         <w:rPr>
           <w:i/>
         </w:rPr>
-        <w:t xml:space="preserve"> обновления образовательных программ в условиях быстро изменяющегося рынка труда. В данной статье предложена система поддержки принятия решений (СППР), основанная на теории свидетельств </w:t>
+        <w:t xml:space="preserve">–Шафера (DST) и обеспечивающая интеграцию разнородных источников — данных о вакансиях, экспертных оценок и прогнозов востребованности навыков, с формальным учётом их неопределённости и противоречивости. Архитектура предложенной системы реализована по двухуровневому принципу: первый уровень выявляет кластеры компетенций с дефицитом покрытия на основе агрегированных свидетельств, а второй уровень – детализирует рекомендации по конкретным навыкам внутри выбранных кластеров. Апробация системы проведена на данных платформы hh.ru (более 13 500 вакансий) и реальной рабочей программе дисциплин по направлению 09.03.02 «Информационные системы и технологии». По результатам проведённых расчётов система выдала рекомендации по шести кластерам: увеличить часы изучения Java и CI/CD; провести дополнительную экспертную оценку (вариативность) для Python, реляционных БД и </w:t>
       </w:r>
       <w:proofErr w:type="spellStart"/>
       <w:r>
         <w:rPr>
           <w:i/>
         </w:rPr>
-        <w:t>Демпстера</w:t>
+        <w:t>Golang</w:t>
       </w:r>
       <w:proofErr w:type="spellEnd"/>
       <w:r>
         <w:rPr>
           <w:i/>
         </w:rPr>
-        <w:t xml:space="preserve">–Шафера (DST) и обеспечивающая интеграцию разнородных источников — данных о вакансиях, экспертных оценок и прогнозов востребованности навыков, с формальным учётом их неопределённости и противоречивости. Архитектура предложенной системы реализована по двухуровневому принципу: первый уровень выявляет кластеры компетенций с дефицитом покрытия на основе агрегированных свидетельств, а второй уровень – детализирует рекомендации по конкретным навыкам внутри выбранных кластеров. Апробация системы проведена на данных платформы hh.ru (более 13 500 вакансий) и реальной рабочей программе дисциплин по направлению 09.03.02 «Информационные системы и технологии». По результатам проведённых расчётов система выдала рекомендации по шести кластерам: увеличить часы изучения </w:t>
-      </w:r>
-      <w:proofErr w:type="spellStart"/>
-      <w:r>
-        <w:rPr>
-          <w:i/>
-        </w:rPr>
-        <w:t>Java</w:t>
-      </w:r>
-      <w:proofErr w:type="spellEnd"/>
-      <w:r>
-        <w:rPr>
-          <w:i/>
-        </w:rPr>
-        <w:t xml:space="preserve"> и CI/CD; провести дополнительную экспертную оценку (вариативность) для </w:t>
-      </w:r>
-      <w:proofErr w:type="spellStart"/>
-      <w:r>
-        <w:rPr>
-          <w:i/>
-        </w:rPr>
-        <w:t>Python</w:t>
-      </w:r>
-      <w:proofErr w:type="spellEnd"/>
-      <w:r>
-        <w:rPr>
-          <w:i/>
-        </w:rPr>
-        <w:t xml:space="preserve">, реляционных БД и </w:t>
-      </w:r>
-      <w:proofErr w:type="spellStart"/>
-      <w:r>
-        <w:rPr>
-          <w:i/>
-        </w:rPr>
-        <w:t>Golang</w:t>
-      </w:r>
-      <w:proofErr w:type="spellEnd"/>
-      <w:r>
-        <w:rPr>
-          <w:i/>
-        </w:rPr>
         <w:t xml:space="preserve"> в связи с неоднозначными сигналами рынка труда; стабилизировать часы, выделенные на 1С.</w:t>
-      </w:r>
-    </w:p>
-    <w:p/>
-    <w:p>
-      <w:pPr>
-        <w:pStyle w:val="1"/>
-      </w:pPr>
-      <w:r>
-        <w:t>Введение</w:t>
       </w:r>
     </w:p>
     <w:p>
+      <w:pPr>
+        <w:spacing w:line="276" w:lineRule="auto"/>
+      </w:pPr>
+    </w:p>
+    <w:p>
+      <w:pPr>
+        <w:pStyle w:val="1"/>
+        <w:spacing w:line="276" w:lineRule="auto"/>
+      </w:pPr>
+      <w:r>
+        <w:t>Введение</w:t>
+      </w:r>
+    </w:p>
+    <w:p>
+      <w:pPr>
+        <w:spacing w:line="276" w:lineRule="auto"/>
+      </w:pPr>
       <w:r>
         <w:t>Ускоряющееся развитие технологий и трансформация рынка труда требуют более частого пересмотра образовательных программ инженерно-технических и IT-направлений, чем это предусмотрено традиционными регламентами. Современные исследования показывают рост интереса к аналитическим методам проектирования учебных планов (УП) и рабочих программ дисциплин (РПД), основанным на данных о структуре программ, результатах обучения и требованиях рынка труда [1]</w:t>
       </w:r>
@@ -341,11 +277,7 @@
         <w:endnoteReference w:id="4"/>
       </w:r>
       <w:r>
-        <w:t xml:space="preserve">. Эти вызовы усиливают потребность в </w:t>
-      </w:r>
-      <w:r>
-        <w:lastRenderedPageBreak/>
-        <w:t>проактивном обновлении программ с учётом как текущего, так и прогнозируемого спроса на навыки [5]</w:t>
+        <w:t>. Эти вызовы усиливают потребность в проактивном обновлении программ с учётом как текущего, так и прогнозируемого спроса на навыки [5]</w:t>
       </w:r>
       <w:r>
         <w:rPr>
@@ -367,6 +299,9 @@
       </w:r>
     </w:p>
     <w:p>
+      <w:pPr>
+        <w:spacing w:line="276" w:lineRule="auto"/>
+      </w:pPr>
       <w:r>
         <w:t>Для практики управления образовательными программами принципиально важно, что требования работодателей быстро смещаются в сторону новых технологических компетенций</w:t>
       </w:r>
@@ -377,7 +312,11 @@
         <w:t xml:space="preserve"> Следовательно, обоснование изменений в </w:t>
       </w:r>
       <w:r>
-        <w:t>рабочих программах дисциплин (</w:t>
+        <w:t xml:space="preserve">рабочих программах дисциплин </w:t>
+      </w:r>
+      <w:r>
+        <w:lastRenderedPageBreak/>
+        <w:t>(</w:t>
       </w:r>
       <w:r>
         <w:t>РПД</w:t>
@@ -434,6 +373,9 @@
       </w:r>
     </w:p>
     <w:p>
+      <w:pPr>
+        <w:spacing w:line="276" w:lineRule="auto"/>
+      </w:pPr>
       <w:r>
         <w:t xml:space="preserve">Настоящая работа рассматривает управленческую задачу проактивного обновления образовательных программ в системе «вуз — рынок труда — работодатели». Задача заключается в обоснованном выборе изменений состава и структуры компетенций (и соответствующих элементов РПД/УП) на горизонте планирования с учётом ограничений учебного процесса (трудоёмкость, </w:t>
       </w:r>
@@ -447,6 +389,9 @@
       </w:r>
     </w:p>
     <w:p>
+      <w:pPr>
+        <w:spacing w:line="276" w:lineRule="auto"/>
+      </w:pPr>
       <w:r>
         <w:t>Существенной особенностью данной задачи</w:t>
       </w:r>
@@ -487,6 +432,9 @@
       </w:r>
     </w:p>
     <w:p>
+      <w:pPr>
+        <w:spacing w:line="276" w:lineRule="auto"/>
+      </w:pPr>
       <w:r>
         <w:t>Цель</w:t>
       </w:r>
@@ -510,6 +458,9 @@
       </w:r>
     </w:p>
     <w:p>
+      <w:pPr>
+        <w:spacing w:line="276" w:lineRule="auto"/>
+      </w:pPr>
       <w:r>
         <w:t>Для достижения поставленной цели решаются задачи</w:t>
       </w:r>
@@ -527,6 +478,7 @@
           <w:ilvl w:val="0"/>
           <w:numId w:val="2"/>
         </w:numPr>
+        <w:spacing w:line="276" w:lineRule="auto"/>
       </w:pPr>
       <w:r>
         <w:t xml:space="preserve">формирование пространства компетенций и правил сопоставления навыков с кластерами; </w:t>
@@ -539,6 +491,7 @@
           <w:ilvl w:val="0"/>
           <w:numId w:val="2"/>
         </w:numPr>
+        <w:spacing w:line="276" w:lineRule="auto"/>
       </w:pPr>
       <w:r>
         <w:t xml:space="preserve">построение свидетельств по каждому источнику; </w:t>
@@ -551,6 +504,7 @@
           <w:ilvl w:val="0"/>
           <w:numId w:val="2"/>
         </w:numPr>
+        <w:spacing w:line="276" w:lineRule="auto"/>
       </w:pPr>
       <w:r>
         <w:t xml:space="preserve">выбор и настройка процедур комбинирования с контролем конфликтности; </w:t>
@@ -563,6 +517,7 @@
           <w:ilvl w:val="0"/>
           <w:numId w:val="2"/>
         </w:numPr>
+        <w:spacing w:line="276" w:lineRule="auto"/>
       </w:pPr>
       <w:r>
         <w:t xml:space="preserve">разработка регламентированных правил формирования рекомендаций по обновлению РПД/УП; </w:t>
@@ -575,23 +530,24 @@
           <w:ilvl w:val="0"/>
           <w:numId w:val="2"/>
         </w:numPr>
+        <w:spacing w:line="276" w:lineRule="auto"/>
       </w:pPr>
       <w:r>
         <w:t>экспериментальная апробация подхода и анализ устойчивости выводов.</w:t>
       </w:r>
     </w:p>
     <w:p>
-      <w:r>
-        <w:t xml:space="preserve">Статья организована следующим образом: первый раздел — анализ существующих подходов и ограничений; второй — метод интеграции на </w:t>
-      </w:r>
-      <w:r>
-        <w:lastRenderedPageBreak/>
-        <w:t>основе теории свидетельств; далее — алгоритмы формирования рекомендаций, результаты апробации и выводы.</w:t>
+      <w:pPr>
+        <w:spacing w:line="276" w:lineRule="auto"/>
+      </w:pPr>
+      <w:r>
+        <w:t>Статья организована следующим образом: первый раздел — анализ существующих подходов и ограничений; второй — метод интеграции на основе теории свидетельств; далее — алгоритмы формирования рекомендаций, результаты апробации и выводы.</w:t>
       </w:r>
     </w:p>
     <w:p>
       <w:pPr>
         <w:pStyle w:val="1"/>
+        <w:spacing w:line="276" w:lineRule="auto"/>
       </w:pPr>
       <w:r>
         <w:t>1. Анализ литературы</w:t>
@@ -600,6 +556,7 @@
     <w:p>
       <w:pPr>
         <w:pStyle w:val="2"/>
+        <w:spacing w:line="276" w:lineRule="auto"/>
         <w:rPr>
           <w:lang w:val="ru-RU"/>
         </w:rPr>
@@ -624,8 +581,15 @@
       </w:r>
     </w:p>
     <w:p>
-      <w:r>
-        <w:t>В последние годы в проектировании образовательных программ наблюдается переход к аналитическим методам, основанным на систематическом анализе данных и требований внешней среды [1]. Выделяются несколько направлений: моделирование структуры программ, оценка соответствия результатов обучения компетенциям, использование внешних источников (рынок труда, профессиональные стандарты, экспертные сообщества) для корректировки содержания, разработка инструментов поддержки решений [1].</w:t>
+      <w:pPr>
+        <w:spacing w:line="276" w:lineRule="auto"/>
+      </w:pPr>
+      <w:r>
+        <w:t xml:space="preserve">В последние годы в проектировании образовательных программ наблюдается переход к аналитическим методам, основанным на систематическом анализе данных и требований внешней среды [1]. Выделяются несколько направлений: моделирование структуры программ, оценка соответствия результатов обучения компетенциям, </w:t>
+      </w:r>
+      <w:r>
+        <w:lastRenderedPageBreak/>
+        <w:t>использование внешних источников (рынок труда, профессиональные стандарты, экспертные сообщества) для корректировки содержания, разработка инструментов поддержки решений [1].</w:t>
       </w:r>
       <w:r>
         <w:t xml:space="preserve"> </w:t>
@@ -641,6 +605,9 @@
       </w:r>
     </w:p>
     <w:p>
+      <w:pPr>
+        <w:spacing w:line="276" w:lineRule="auto"/>
+      </w:pPr>
       <w:r>
         <w:t xml:space="preserve">Важным драйвером изменений остаётся несоответствие между ожиданиями выпускников и условиями рынка труда [2], а также институциональные меры ускоренной подготовки ИТ-кадров [3]. Источники рыночной информации показывают быстрый рост спроса на компетенции в области </w:t>
       </w:r>
@@ -663,6 +630,9 @@
       </w:r>
     </w:p>
     <w:p>
+      <w:pPr>
+        <w:spacing w:line="276" w:lineRule="auto"/>
+      </w:pPr>
       <w:r>
         <w:t>Развиваются методы прогнозирования востребованности навыков на основе временной динамики и обучения представлений [5, 10]</w:t>
       </w:r>
@@ -684,6 +654,9 @@
       </w:r>
     </w:p>
     <w:p>
+      <w:pPr>
+        <w:spacing w:line="276" w:lineRule="auto"/>
+      </w:pPr>
       <w:r>
         <w:t>Вместе с тем сохраняются методические трудности:</w:t>
       </w:r>
@@ -695,6 +668,7 @@
           <w:ilvl w:val="0"/>
           <w:numId w:val="3"/>
         </w:numPr>
+        <w:spacing w:line="276" w:lineRule="auto"/>
       </w:pPr>
       <w:r>
         <w:t>разнородность и разное качество источников (шум в вакансиях, субъективность экспертных оценок, модельная неопределённость прогнозов) [5–7];</w:t>
@@ -707,12 +681,16 @@
           <w:ilvl w:val="0"/>
           <w:numId w:val="3"/>
         </w:numPr>
+        <w:spacing w:line="276" w:lineRule="auto"/>
       </w:pPr>
       <w:r>
         <w:t>необходимость формального различения ситуаций «низкая значимость» и «недостаточность информации», а также выявления противоречий между источниками.</w:t>
       </w:r>
     </w:p>
     <w:p>
+      <w:pPr>
+        <w:spacing w:line="276" w:lineRule="auto"/>
+      </w:pPr>
       <w:r>
         <w:t>Эмпирические исследования всё чаще используют обработку естественного языка и тематическое моделирование для сопоставления содержания курсов и текстов вакансий, особенно в быстро меняющихся областях, таких как ИИ [11, 12]</w:t>
       </w:r>
@@ -801,6 +779,7 @@
     <w:p>
       <w:pPr>
         <w:pStyle w:val="2"/>
+        <w:spacing w:line="276" w:lineRule="auto"/>
         <w:rPr>
           <w:lang w:val="ru-RU"/>
         </w:rPr>
@@ -809,7 +788,6 @@
         <w:rPr>
           <w:lang w:val="ru-RU"/>
         </w:rPr>
-        <w:lastRenderedPageBreak/>
         <w:t>1.2.</w:t>
       </w:r>
       <w:r>
@@ -823,11 +801,17 @@
       </w:r>
     </w:p>
     <w:p>
+      <w:pPr>
+        <w:spacing w:line="276" w:lineRule="auto"/>
+      </w:pPr>
       <w:r>
         <w:t>Традиционные подходы к интеграции данных (вероятностные модели, многокритериальная свёртка, согласование экспертных оценок) плохо справляются с неполнотой и противоречивостью источников, особенно с интерпретацией «отсутствия подтверждения».</w:t>
       </w:r>
     </w:p>
     <w:p>
+      <w:pPr>
+        <w:spacing w:line="276" w:lineRule="auto"/>
+      </w:pPr>
       <w:r>
         <w:t xml:space="preserve">Теория свидетельств </w:t>
       </w:r>
@@ -919,6 +903,9 @@
       </w:r>
     </w:p>
     <w:p>
+      <w:pPr>
+        <w:spacing w:line="276" w:lineRule="auto"/>
+      </w:pPr>
       <w:r>
         <w:t xml:space="preserve">Для количественной оценки различий между свидетельствами используется расстояние </w:t>
       </w:r>
@@ -997,7 +984,11 @@
       </w:r>
     </w:p>
     <w:p>
-      <w:r>
+      <w:pPr>
+        <w:spacing w:line="276" w:lineRule="auto"/>
+      </w:pPr>
+      <w:r>
+        <w:lastRenderedPageBreak/>
         <w:t>DST успешно применяется в задачах распределения ресурсов [23]</w:t>
       </w:r>
       <w:r>
@@ -1062,6 +1053,9 @@
       </w:r>
     </w:p>
     <w:p>
+      <w:pPr>
+        <w:spacing w:line="276" w:lineRule="auto"/>
+      </w:pPr>
       <w:r>
         <w:t>Рост значимости компетенций в области ИИ и «зелёных» технологий сопровождается сменой практик найма: в ряде сегментов работодатели всё чаще ориентируются на конкретные навыки, а не на формальные квалификации. Это усиливает роль извлечения и нормализации навыков как базового уровня управленческой информации и повышает требования к корректной обработке неопределённости и противоречий между источниками при подготовке рекомендаций по обновлению образовательных программ</w:t>
       </w:r>
@@ -1088,6 +1082,9 @@
       </w:r>
     </w:p>
     <w:p>
+      <w:pPr>
+        <w:spacing w:line="276" w:lineRule="auto"/>
+      </w:pPr>
       <w:r>
         <w:t>Таким образом, обзор работ приводит к двум выводам, важным для задачи проактивного обновления образовательных программ. Во-первых, использование данных рынка труда и прогнозов позволяет включать внешнюю динамику в контур управления программами, но обостряет проблему неоднородных, неполных и конфликтных источников. Во-вторых, аппарат DST даёт формальные средства представления неопределённости, интеграции разнородных свидетельств и управления конфликтом через правила комбинирования, меры расстояния и энтропийные показатели. Это обосновывает выбор DST в качестве ядра разрабатываемой системы поддержки решений по обновлению программ на основе рыночных данных.</w:t>
       </w:r>
@@ -1098,6 +1095,7 @@
     <w:p>
       <w:pPr>
         <w:pStyle w:val="1"/>
+        <w:spacing w:line="276" w:lineRule="auto"/>
       </w:pPr>
       <w:r>
         <w:t>2</w:t>
@@ -1110,15 +1108,14 @@
       </w:r>
     </w:p>
     <w:p>
+      <w:pPr>
+        <w:spacing w:line="276" w:lineRule="auto"/>
+      </w:pPr>
       <w:r>
         <w:t>Проактивное обновление образовательных программ</w:t>
       </w:r>
       <w:r>
-        <w:t xml:space="preserve"> в организационной системе «вуз — рынок труда — работодатели» рассматривается как управленческая задача выбора и обоснования изменений состава и структуры </w:t>
-      </w:r>
-      <w:r>
-        <w:lastRenderedPageBreak/>
-        <w:t xml:space="preserve">формируемых компетенций на горизонте планирования при наличии организационно-ресурсных ограничений (трудоёмкость дисциплин, </w:t>
+        <w:t xml:space="preserve"> в организационной системе «вуз — рынок труда — работодатели» рассматривается как управленческая задача выбора и обоснования изменений состава и структуры формируемых компетенций на горизонте планирования при наличии организационно-ресурсных ограничений (трудоёмкость дисциплин, </w:t>
       </w:r>
       <w:proofErr w:type="spellStart"/>
       <w:r>
@@ -1130,6 +1127,9 @@
       </w:r>
     </w:p>
     <w:p>
+      <w:pPr>
+        <w:spacing w:line="276" w:lineRule="auto"/>
+      </w:pPr>
       <w:r>
         <w:t xml:space="preserve">Информационная база решения неоднородна и включает четыре источника (рис. 1): </w:t>
       </w:r>
@@ -1179,6 +1179,9 @@
       </w:r>
     </w:p>
     <w:p>
+      <w:pPr>
+        <w:spacing w:line="276" w:lineRule="auto"/>
+      </w:pPr>
       <w:r>
         <w:t xml:space="preserve">После нормализации и сопоставления данных формируется единое пространство компетенций </w:t>
       </w:r>
@@ -1219,7 +1222,11 @@
         <w:t xml:space="preserve"> </w:t>
       </w:r>
       <w:r>
-        <w:t xml:space="preserve">и диагностировать противоречивость по показателю конфликтности </w:t>
+        <w:t xml:space="preserve">и диагностировать противоречивость по показателю </w:t>
+      </w:r>
+      <w:r>
+        <w:lastRenderedPageBreak/>
+        <w:t xml:space="preserve">конфликтности </w:t>
       </w:r>
       <m:oMath>
         <m:r>
@@ -1263,6 +1270,9 @@
       </w:r>
     </w:p>
     <w:p>
+      <w:pPr>
+        <w:spacing w:line="276" w:lineRule="auto"/>
+      </w:pPr>
       <w:r>
         <w:t>У</w:t>
       </w:r>
@@ -1364,13 +1374,13 @@
           </w:tcPr>
           <w:p>
             <w:pPr>
+              <w:spacing w:line="276" w:lineRule="auto"/>
               <w:ind w:firstLine="0"/>
             </w:pPr>
             <w:r>
               <w:rPr>
                 <w:noProof/>
               </w:rPr>
-              <w:lastRenderedPageBreak/>
               <w:drawing>
                 <wp:inline distT="0" distB="0" distL="0" distR="0" wp14:anchorId="50C52EE7" wp14:editId="09BA5899">
                   <wp:extent cx="5819422" cy="3179094"/>
@@ -1418,6 +1428,7 @@
           <w:p>
             <w:pPr>
               <w:pStyle w:val="af3"/>
+              <w:spacing w:line="276" w:lineRule="auto"/>
               <w:ind w:firstLine="0"/>
               <w:jc w:val="left"/>
             </w:pPr>
@@ -1706,6 +1717,9 @@
       </w:tr>
     </w:tbl>
     <w:p>
+      <w:pPr>
+        <w:spacing w:line="276" w:lineRule="auto"/>
+      </w:pPr>
       <w:r>
         <w:t>Следствием разнородности источников является необходимость различать два случая: (i) компетенция действительно теряет актуальность и подлежит сокращению в обязательной части программы; (</w:t>
       </w:r>
@@ -1768,8 +1782,10 @@
     <w:p>
       <w:pPr>
         <w:pStyle w:val="1"/>
-      </w:pPr>
-      <w:r>
+        <w:spacing w:line="276" w:lineRule="auto"/>
+      </w:pPr>
+      <w:r>
+        <w:lastRenderedPageBreak/>
         <w:t xml:space="preserve">3. Модель принятия решений на основе теории </w:t>
       </w:r>
       <w:proofErr w:type="spellStart"/>
@@ -1782,6 +1798,9 @@
       </w:r>
     </w:p>
     <w:p>
+      <w:pPr>
+        <w:spacing w:line="276" w:lineRule="auto"/>
+      </w:pPr>
       <w:r>
         <w:t xml:space="preserve">Для интеграции разнородных источников данных о компетенциях вводится рамка различения </w:t>
       </w:r>
@@ -2272,6 +2291,7 @@
     </w:p>
     <w:p>
       <w:pPr>
+        <w:spacing w:line="276" w:lineRule="auto"/>
         <w:rPr>
           <w:b/>
           <w:bCs/>
@@ -2288,9 +2308,9 @@
     <w:p>
       <w:pPr>
         <w:pStyle w:val="3"/>
-      </w:pPr>
-      <w:r>
-        <w:lastRenderedPageBreak/>
+        <w:spacing w:line="276" w:lineRule="auto"/>
+      </w:pPr>
+      <w:r>
         <w:t xml:space="preserve">3.1.1. Источник </w:t>
       </w:r>
       <m:oMath>
@@ -2306,6 +2326,9 @@
       </w:r>
     </w:p>
     <w:p>
+      <w:pPr>
+        <w:spacing w:line="276" w:lineRule="auto"/>
+      </w:pPr>
       <w:r>
         <w:t xml:space="preserve">Для источника </w:t>
       </w:r>
@@ -2682,11 +2705,17 @@
       </w:r>
     </w:p>
     <w:p>
+      <w:pPr>
+        <w:spacing w:line="276" w:lineRule="auto"/>
+      </w:pPr>
       <w:r>
         <w:t>Агрегированная релевантность кластера определяется формулой:</w:t>
       </w:r>
     </w:p>
     <w:p>
+      <w:pPr>
+        <w:spacing w:line="276" w:lineRule="auto"/>
+      </w:pPr>
       <m:oMathPara>
         <m:oMath>
           <m:sSub>
@@ -2947,6 +2976,9 @@
       </m:oMathPara>
     </w:p>
     <w:p>
+      <w:pPr>
+        <w:spacing w:line="276" w:lineRule="auto"/>
+      </w:pPr>
       <w:r>
         <w:t xml:space="preserve">Для учёта объёма данных используется коэффициент уверенности </w:t>
       </w:r>
@@ -2988,6 +3020,9 @@
       </w:r>
     </w:p>
     <w:p>
+      <w:pPr>
+        <w:spacing w:line="276" w:lineRule="auto"/>
+      </w:pPr>
       <m:oMathPara>
         <m:oMath>
           <m:sSub>
@@ -3101,6 +3136,7 @@
     </w:p>
     <w:p>
       <w:pPr>
+        <w:spacing w:line="276" w:lineRule="auto"/>
         <w:ind w:firstLine="0"/>
       </w:pPr>
       <w:r>
@@ -3138,6 +3174,9 @@
       </w:r>
     </w:p>
     <w:p>
+      <w:pPr>
+        <w:spacing w:line="276" w:lineRule="auto"/>
+      </w:pPr>
       <m:oMathPara>
         <m:oMath>
           <m:sSub>
@@ -3406,6 +3445,7 @@
     <w:p>
       <w:pPr>
         <w:pStyle w:val="3"/>
+        <w:spacing w:line="276" w:lineRule="auto"/>
       </w:pPr>
       <w:r>
         <w:t xml:space="preserve">3.1.2. Источник </w:t>
@@ -3423,6 +3463,9 @@
       </w:r>
     </w:p>
     <w:p>
+      <w:pPr>
+        <w:spacing w:line="276" w:lineRule="auto"/>
+      </w:pPr>
       <w:r>
         <w:t xml:space="preserve">BPA для источника </w:t>
       </w:r>
@@ -3727,6 +3770,9 @@
       </w:r>
     </w:p>
     <w:p>
+      <w:pPr>
+        <w:spacing w:line="276" w:lineRule="auto"/>
+      </w:pPr>
       <w:r>
         <w:t>Агрегированная «</w:t>
       </w:r>
@@ -3740,6 +3786,9 @@
       </w:r>
     </w:p>
     <w:p>
+      <w:pPr>
+        <w:spacing w:line="276" w:lineRule="auto"/>
+      </w:pPr>
       <m:oMathPara>
         <m:oMath>
           <m:sSubSup>
@@ -4016,11 +4065,17 @@
       </m:oMathPara>
     </w:p>
     <w:p>
+      <w:pPr>
+        <w:spacing w:line="276" w:lineRule="auto"/>
+      </w:pPr>
       <w:r>
         <w:t>Коэффициент уверенности по объёму и полноте стандарта:</w:t>
       </w:r>
     </w:p>
     <w:p>
+      <w:pPr>
+        <w:spacing w:line="276" w:lineRule="auto"/>
+      </w:pPr>
       <m:oMathPara>
         <m:oMath>
           <m:sSub>
@@ -4206,9 +4261,11 @@
     </w:p>
     <w:p>
       <w:pPr>
+        <w:spacing w:line="276" w:lineRule="auto"/>
         <w:ind w:firstLine="0"/>
       </w:pPr>
       <w:r>
+        <w:lastRenderedPageBreak/>
         <w:t xml:space="preserve">где </w:t>
       </w:r>
       <m:oMath>
@@ -4336,11 +4393,17 @@
       </w:r>
     </w:p>
     <w:p>
+      <w:pPr>
+        <w:spacing w:line="276" w:lineRule="auto"/>
+      </w:pPr>
       <w:r>
         <w:t>Тогда:</w:t>
       </w:r>
     </w:p>
     <w:p>
+      <w:pPr>
+        <w:spacing w:line="276" w:lineRule="auto"/>
+      </w:pPr>
       <m:oMathPara>
         <m:oMath>
           <m:sSub>
@@ -4699,9 +4762,9 @@
     <w:p>
       <w:pPr>
         <w:pStyle w:val="3"/>
-      </w:pPr>
-      <w:r>
-        <w:lastRenderedPageBreak/>
+        <w:spacing w:line="276" w:lineRule="auto"/>
+      </w:pPr>
+      <w:r>
         <w:t xml:space="preserve">3.1.3. Источник </w:t>
       </w:r>
       <m:oMath>
@@ -4720,6 +4783,9 @@
       </w:r>
     </w:p>
     <w:p>
+      <w:pPr>
+        <w:spacing w:line="276" w:lineRule="auto"/>
+      </w:pPr>
       <w:r>
         <w:t xml:space="preserve">Пусть </w:t>
       </w:r>
@@ -4761,6 +4827,9 @@
       </w:r>
     </w:p>
     <w:p>
+      <w:pPr>
+        <w:spacing w:line="276" w:lineRule="auto"/>
+      </w:pPr>
       <m:oMathPara>
         <m:oMath>
           <m:sSubSup>
@@ -4965,6 +5034,9 @@
       </m:oMathPara>
     </w:p>
     <w:p>
+      <w:pPr>
+        <w:spacing w:line="276" w:lineRule="auto"/>
+      </w:pPr>
       <w:r>
         <w:t xml:space="preserve">Здесь </w:t>
       </w:r>
@@ -5162,11 +5234,17 @@
       </w:r>
     </w:p>
     <w:p>
+      <w:pPr>
+        <w:spacing w:line="276" w:lineRule="auto"/>
+      </w:pPr>
       <w:r>
         <w:t>Уверенность по размеру и согласованности экспертной группы:</w:t>
       </w:r>
     </w:p>
     <w:p>
+      <w:pPr>
+        <w:spacing w:line="276" w:lineRule="auto"/>
+      </w:pPr>
       <m:oMathPara>
         <m:oMath>
           <m:sSub>
@@ -5524,11 +5602,17 @@
       </m:oMathPara>
     </w:p>
     <w:p>
+      <w:pPr>
+        <w:spacing w:line="276" w:lineRule="auto"/>
+      </w:pPr>
       <w:r>
         <w:t>Тогда:</w:t>
       </w:r>
     </w:p>
     <w:p>
+      <w:pPr>
+        <w:spacing w:line="276" w:lineRule="auto"/>
+      </w:pPr>
       <m:oMathPara>
         <m:oMath>
           <m:sSub>
@@ -5885,6 +5969,9 @@
       </m:oMathPara>
     </w:p>
     <w:p>
+      <w:pPr>
+        <w:spacing w:line="276" w:lineRule="auto"/>
+      </w:pPr>
       <w:r>
         <w:t xml:space="preserve">Коэффициент </w:t>
       </w:r>
@@ -5988,6 +6075,7 @@
     <w:p>
       <w:pPr>
         <w:pStyle w:val="3"/>
+        <w:spacing w:line="276" w:lineRule="auto"/>
       </w:pPr>
       <w:r>
         <w:t xml:space="preserve">3.1.4. Источник </w:t>
@@ -6005,6 +6093,9 @@
       </w:r>
     </w:p>
     <w:p>
+      <w:pPr>
+        <w:spacing w:line="276" w:lineRule="auto"/>
+      </w:pPr>
       <w:r>
         <w:t xml:space="preserve">Для источника </w:t>
       </w:r>
@@ -6027,6 +6118,9 @@
       </w:r>
     </w:p>
     <w:p>
+      <w:pPr>
+        <w:spacing w:line="276" w:lineRule="auto"/>
+      </w:pPr>
       <w:r>
         <w:rPr>
           <w:i/>
@@ -6053,6 +6147,9 @@
       </w:r>
     </w:p>
     <w:p>
+      <w:pPr>
+        <w:spacing w:line="276" w:lineRule="auto"/>
+      </w:pPr>
       <m:oMathPara>
         <m:oMath>
           <m:sSubSup>
@@ -6197,6 +6294,7 @@
     </w:p>
     <w:p>
       <w:pPr>
+        <w:spacing w:line="276" w:lineRule="auto"/>
         <w:ind w:firstLine="0"/>
       </w:pPr>
       <w:r>
@@ -6321,6 +6419,9 @@
       </w:r>
     </w:p>
     <w:p>
+      <w:pPr>
+        <w:spacing w:line="276" w:lineRule="auto"/>
+      </w:pPr>
       <w:r>
         <w:rPr>
           <w:i/>
@@ -6424,6 +6525,9 @@
       </w:r>
     </w:p>
     <w:p>
+      <w:pPr>
+        <w:spacing w:line="276" w:lineRule="auto"/>
+      </w:pPr>
       <m:oMathPara>
         <m:oMath>
           <m:sSub>
@@ -6518,6 +6622,7 @@
     </w:p>
     <w:p>
       <w:pPr>
+        <w:spacing w:line="276" w:lineRule="auto"/>
         <w:ind w:firstLine="0"/>
       </w:pPr>
       <w:r>
@@ -6608,11 +6713,17 @@
       </w:r>
     </w:p>
     <w:p>
+      <w:pPr>
+        <w:spacing w:line="276" w:lineRule="auto"/>
+      </w:pPr>
       <w:r>
         <w:t>Тогда:</w:t>
       </w:r>
     </w:p>
     <w:p>
+      <w:pPr>
+        <w:spacing w:line="276" w:lineRule="auto"/>
+      </w:pPr>
       <m:oMathPara>
         <m:oMath>
           <m:sSub>
@@ -6969,7 +7080,11 @@
       </m:oMathPara>
     </w:p>
     <w:p>
-      <w:r>
+      <w:pPr>
+        <w:spacing w:line="276" w:lineRule="auto"/>
+      </w:pPr>
+      <w:r>
+        <w:lastRenderedPageBreak/>
         <w:t xml:space="preserve">При ухудшении точности прогноза </w:t>
       </w:r>
       <m:oMath>
@@ -7063,9 +7178,9 @@
     <w:p>
       <w:pPr>
         <w:pStyle w:val="3"/>
-      </w:pPr>
-      <w:r>
-        <w:lastRenderedPageBreak/>
+        <w:spacing w:line="276" w:lineRule="auto"/>
+      </w:pPr>
+      <w:r>
         <w:t xml:space="preserve">3.1.5. </w:t>
       </w:r>
       <w:r>
@@ -7073,6 +7188,9 @@
       </w:r>
     </w:p>
     <w:p>
+      <w:pPr>
+        <w:spacing w:line="276" w:lineRule="auto"/>
+      </w:pPr>
       <w:r>
         <w:t xml:space="preserve">Для учёта различий надёжности источников применяется дисконтирование. Для любого </w:t>
       </w:r>
@@ -7118,6 +7236,9 @@
       </w:r>
     </w:p>
     <w:p>
+      <w:pPr>
+        <w:spacing w:line="276" w:lineRule="auto"/>
+      </w:pPr>
       <m:oMathPara>
         <m:oMath>
           <m:sSubSup>
@@ -7363,6 +7484,7 @@
     </w:p>
     <w:p>
       <w:pPr>
+        <w:spacing w:line="276" w:lineRule="auto"/>
         <w:ind w:firstLine="0"/>
       </w:pPr>
       <w:r>
@@ -7564,6 +7686,9 @@
       </w:r>
     </w:p>
     <w:p>
+      <w:pPr>
+        <w:spacing w:line="276" w:lineRule="auto"/>
+      </w:pPr>
       <w:r>
         <w:t xml:space="preserve">Вес </w:t>
       </w:r>
@@ -7934,6 +8059,9 @@
       </w:r>
     </w:p>
     <w:p>
+      <w:pPr>
+        <w:spacing w:line="276" w:lineRule="auto"/>
+      </w:pPr>
       <m:oMathPara>
         <m:oMath>
           <m:sSub>
@@ -8274,6 +8402,7 @@
     </w:p>
     <w:p>
       <w:pPr>
+        <w:spacing w:line="276" w:lineRule="auto"/>
         <w:ind w:firstLine="0"/>
       </w:pPr>
       <w:r>
@@ -8442,6 +8571,7 @@
     <w:p>
       <w:pPr>
         <w:pStyle w:val="3"/>
+        <w:spacing w:line="276" w:lineRule="auto"/>
       </w:pPr>
       <w:r>
         <w:t xml:space="preserve">3.1.6. </w:t>
@@ -8451,6 +8581,9 @@
       </w:r>
     </w:p>
     <w:p>
+      <w:pPr>
+        <w:spacing w:line="276" w:lineRule="auto"/>
+      </w:pPr>
       <w:r>
         <w:t xml:space="preserve">Объединение свидетельств выполняется последовательным применением правила </w:t>
       </w:r>
@@ -8585,11 +8718,17 @@
       </w:r>
     </w:p>
     <w:p>
+      <w:pPr>
+        <w:spacing w:line="276" w:lineRule="auto"/>
+      </w:pPr>
       <w:r>
         <w:t>запись (в каноническом виде) такая:</w:t>
       </w:r>
     </w:p>
     <w:p>
+      <w:pPr>
+        <w:spacing w:line="276" w:lineRule="auto"/>
+      </w:pPr>
       <m:oMathPara>
         <m:oMath>
           <m:r>
@@ -8969,6 +9108,7 @@
     </w:p>
     <w:p>
       <w:pPr>
+        <w:spacing w:line="276" w:lineRule="auto"/>
         <w:ind w:firstLine="0"/>
       </w:pPr>
       <w:r>
@@ -9144,10 +9284,14 @@
     </w:p>
     <w:p>
       <w:pPr>
+        <w:spacing w:line="276" w:lineRule="auto"/>
         <w:ind w:firstLine="0"/>
       </w:pPr>
     </w:p>
     <w:p>
+      <w:pPr>
+        <w:spacing w:line="276" w:lineRule="auto"/>
+      </w:pPr>
       <w:r>
         <w:t xml:space="preserve">При превышении порога </w:t>
       </w:r>
@@ -9295,6 +9439,9 @@
       </w:r>
     </w:p>
     <w:p>
+      <w:pPr>
+        <w:spacing w:line="276" w:lineRule="auto"/>
+      </w:pPr>
       <m:oMathPara>
         <m:oMath>
           <m:sSup>
@@ -9505,12 +9652,16 @@
     <w:p>
       <w:pPr>
         <w:pStyle w:val="3"/>
+        <w:spacing w:line="276" w:lineRule="auto"/>
       </w:pPr>
       <w:r>
         <w:t>3.1.7. Построение итоговых оценок и правила принятия решения</w:t>
       </w:r>
     </w:p>
     <w:p>
+      <w:pPr>
+        <w:spacing w:line="276" w:lineRule="auto"/>
+      </w:pPr>
       <w:r>
         <w:t xml:space="preserve">По итоговому распределению масс </w:t>
       </w:r>
@@ -9552,7 +9703,6 @@
           <w:rPr>
             <w:rFonts w:ascii="Cambria Math" w:hAnsi="Cambria Math"/>
           </w:rPr>
-          <w:lastRenderedPageBreak/>
           <m:t>A⊆</m:t>
         </m:r>
         <m:r>
@@ -9643,6 +9793,9 @@
       </w:r>
     </w:p>
     <w:p>
+      <w:pPr>
+        <w:spacing w:line="276" w:lineRule="auto"/>
+      </w:pPr>
       <m:oMathPara>
         <m:oMath>
           <m:r>
@@ -9955,7 +10108,11 @@
       </m:oMathPara>
     </w:p>
     <w:p>
-      <w:r>
+      <w:pPr>
+        <w:spacing w:line="276" w:lineRule="auto"/>
+      </w:pPr>
+      <w:r>
+        <w:lastRenderedPageBreak/>
         <w:t xml:space="preserve">Значение </w:t>
       </w:r>
       <m:oMath>
@@ -10007,6 +10164,9 @@
       </w:r>
     </w:p>
     <w:p>
+      <w:pPr>
+        <w:spacing w:line="276" w:lineRule="auto"/>
+      </w:pPr>
       <w:r>
         <w:t xml:space="preserve">Для получения ранжирования одноэлементных гипотез применяется вероятностная мера для принятия решения </w:t>
       </w:r>
@@ -10023,6 +10183,9 @@
       </w:r>
     </w:p>
     <w:p>
+      <w:pPr>
+        <w:spacing w:line="276" w:lineRule="auto"/>
+      </w:pPr>
       <m:oMathPara>
         <m:oMath>
           <m:r>
@@ -10262,6 +10425,9 @@
       </m:oMathPara>
     </w:p>
     <w:p>
+      <w:pPr>
+        <w:spacing w:line="276" w:lineRule="auto"/>
+      </w:pPr>
       <w:r>
         <w:t xml:space="preserve">Величины </w:t>
       </w:r>
@@ -10345,11 +10511,17 @@
       </w:r>
     </w:p>
     <w:p>
+      <w:pPr>
+        <w:spacing w:line="276" w:lineRule="auto"/>
+      </w:pPr>
       <w:r>
         <w:t>Для обоснования управленческого воздействия вводится показатель дефицита компетенции:</w:t>
       </w:r>
     </w:p>
     <w:p>
+      <w:pPr>
+        <w:spacing w:line="276" w:lineRule="auto"/>
+      </w:pPr>
       <m:oMathPara>
         <m:oMath>
           <m:sSub>
@@ -10453,6 +10625,7 @@
     </w:p>
     <w:p>
       <w:pPr>
+        <w:spacing w:line="276" w:lineRule="auto"/>
         <w:ind w:firstLine="0"/>
       </w:pPr>
       <w:r>
@@ -10699,6 +10872,9 @@
       </w:r>
     </w:p>
     <w:p>
+      <w:pPr>
+        <w:spacing w:line="276" w:lineRule="auto"/>
+      </w:pPr>
       <w:r>
         <w:t xml:space="preserve">Принятие решения задаётся регламентом на основе трёх порогов: </w:t>
       </w:r>
@@ -11045,6 +11221,9 @@
       </w:r>
     </w:p>
     <w:p>
+      <w:pPr>
+        <w:spacing w:line="276" w:lineRule="auto"/>
+      </w:pPr>
       <w:r>
         <w:t xml:space="preserve">Регламент принятия решения для каждого кластера </w:t>
       </w:r>
@@ -11091,6 +11270,7 @@
         <w:tabs>
           <w:tab w:val="num" w:pos="720"/>
         </w:tabs>
+        <w:spacing w:line="276" w:lineRule="auto"/>
       </w:pPr>
       <w:r>
         <w:rPr>
@@ -11104,6 +11284,9 @@
       </w:r>
     </w:p>
     <w:p>
+      <w:pPr>
+        <w:spacing w:line="276" w:lineRule="auto"/>
+      </w:pPr>
       <m:oMathPara>
         <m:oMath>
           <m:sSub>
@@ -11292,6 +11475,9 @@
       </m:oMathPara>
     </w:p>
     <w:p>
+      <w:pPr>
+        <w:spacing w:line="276" w:lineRule="auto"/>
+      </w:pPr>
       <w:r>
         <w:t xml:space="preserve">В этом случае формируется рекомендация на усиление содержания и/или трудоёмкости компонентов программы, связанных с кластером </w:t>
       </w:r>
@@ -11335,6 +11521,7 @@
         <w:tabs>
           <w:tab w:val="num" w:pos="720"/>
         </w:tabs>
+        <w:spacing w:line="276" w:lineRule="auto"/>
       </w:pPr>
       <w:r>
         <w:rPr>
@@ -11349,6 +11536,7 @@
     </w:p>
     <w:p>
       <w:pPr>
+        <w:spacing w:line="276" w:lineRule="auto"/>
         <w:ind w:left="360" w:firstLine="0"/>
         <w:rPr>
           <w:i/>
@@ -11558,6 +11746,7 @@
     </w:p>
     <w:p>
       <w:pPr>
+        <w:spacing w:line="276" w:lineRule="auto"/>
         <w:ind w:left="360" w:firstLine="0"/>
       </w:pPr>
       <w:r>
@@ -11600,11 +11789,7 @@
         <w:t>, а</w:t>
       </w:r>
       <w:r>
-        <w:t xml:space="preserve"> формируется рекомендация о включении изменений в вариативную часть </w:t>
-      </w:r>
-      <w:r>
-        <w:lastRenderedPageBreak/>
-        <w:t>и/или о проведении дополнительной экспертной процедуры для снижения неопределённости и разрешения конфликта источников.</w:t>
+        <w:t xml:space="preserve"> формируется рекомендация о включении изменений в вариативную часть и/или о проведении дополнительной экспертной процедуры для снижения неопределённости и разрешения конфликта источников.</w:t>
       </w:r>
     </w:p>
     <w:p>
@@ -11613,6 +11798,7 @@
           <w:ilvl w:val="0"/>
           <w:numId w:val="11"/>
         </w:numPr>
+        <w:spacing w:line="276" w:lineRule="auto"/>
       </w:pPr>
       <w:r>
         <w:rPr>
@@ -11776,6 +11962,9 @@
       </w:r>
     </w:p>
     <w:p>
+      <w:pPr>
+        <w:spacing w:line="276" w:lineRule="auto"/>
+      </w:pPr>
       <w:r>
         <w:t xml:space="preserve">Таким образом, управленческое решение формируется не только на основании величины дефицита </w:t>
       </w:r>
@@ -11881,15 +12070,20 @@
     <w:p>
       <w:pPr>
         <w:pStyle w:val="3"/>
+        <w:spacing w:line="276" w:lineRule="auto"/>
       </w:pPr>
       <w:r>
         <w:rPr>
           <w:rFonts w:eastAsia="Times New Roman"/>
         </w:rPr>
+        <w:lastRenderedPageBreak/>
         <w:t>3.1.8. Двухуровневая детализация управленческого воздействия (кластер → навыки).</w:t>
       </w:r>
     </w:p>
     <w:p>
+      <w:pPr>
+        <w:spacing w:line="276" w:lineRule="auto"/>
+      </w:pPr>
       <w:r>
         <w:t xml:space="preserve">На уровне 1 управленческое решение формируется по кластерам компетенций </w:t>
       </w:r>
@@ -12118,6 +12312,9 @@
       </w:r>
     </w:p>
     <w:p>
+      <w:pPr>
+        <w:spacing w:line="276" w:lineRule="auto"/>
+      </w:pPr>
       <m:oMathPara>
         <m:oMath>
           <m:sSup>
@@ -12447,6 +12644,9 @@
       </m:oMathPara>
     </w:p>
     <w:p>
+      <w:pPr>
+        <w:spacing w:line="276" w:lineRule="auto"/>
+      </w:pPr>
       <w:r>
         <w:t xml:space="preserve">Для каждого навыка </w:t>
       </w:r>
@@ -12708,44 +12908,55 @@
         <w:t>асчёт локальных масс и формирование рекомендаций выполняются как процедура уточнения управленческого воздействия внутри выбранного кластера.</w:t>
       </w:r>
     </w:p>
-    <w:p/>
-    <w:p/>
     <w:p>
       <w:pPr>
-        <w:pStyle w:val="1"/>
-      </w:pPr>
-      <w:r>
-        <w:t xml:space="preserve">4. </w:t>
-      </w:r>
-      <w:r>
-        <w:t>Реализация</w:t>
-      </w:r>
-      <w:r>
-        <w:t xml:space="preserve"> и экспериментальная апробация</w:t>
-      </w:r>
+        <w:spacing w:line="276" w:lineRule="auto"/>
+      </w:pPr>
     </w:p>
     <w:p>
       <w:pPr>
-        <w:pStyle w:val="2"/>
-        <w:rPr>
-          <w:lang w:val="ru-RU"/>
-        </w:rPr>
-      </w:pPr>
-      <w:r>
-        <w:rPr>
-          <w:lang w:val="ru-RU"/>
-        </w:rPr>
-        <w:t>4</w:t>
-      </w:r>
-      <w:r>
-        <w:rPr>
-          <w:lang w:val="ru-RU"/>
-        </w:rPr>
-        <w:t>.1. Архитектура системы и источники данных</w:t>
-      </w:r>
+        <w:spacing w:line="276" w:lineRule="auto"/>
+      </w:pPr>
     </w:p>
     <w:p>
       <w:pPr>
+        <w:pStyle w:val="1"/>
+        <w:spacing w:line="276" w:lineRule="auto"/>
+      </w:pPr>
+      <w:r>
+        <w:t xml:space="preserve">4. </w:t>
+      </w:r>
+      <w:r>
+        <w:t>Реализация</w:t>
+      </w:r>
+      <w:r>
+        <w:t xml:space="preserve"> и экспериментальная апробация</w:t>
+      </w:r>
+    </w:p>
+    <w:p>
+      <w:pPr>
+        <w:pStyle w:val="2"/>
+        <w:spacing w:line="276" w:lineRule="auto"/>
+        <w:rPr>
+          <w:lang w:val="ru-RU"/>
+        </w:rPr>
+      </w:pPr>
+      <w:r>
+        <w:rPr>
+          <w:lang w:val="ru-RU"/>
+        </w:rPr>
+        <w:t>4</w:t>
+      </w:r>
+      <w:r>
+        <w:rPr>
+          <w:lang w:val="ru-RU"/>
+        </w:rPr>
+        <w:t>.1. Архитектура системы и источники данных</w:t>
+      </w:r>
+    </w:p>
+    <w:p>
+      <w:pPr>
+        <w:spacing w:line="276" w:lineRule="auto"/>
         <w:rPr>
           <w:rFonts w:eastAsia="MS Mincho"/>
           <w:lang w:eastAsia="en-US"/>
@@ -12873,6 +13084,7 @@
           </w:tcPr>
           <w:p>
             <w:pPr>
+              <w:spacing w:line="276" w:lineRule="auto"/>
               <w:ind w:firstLine="0"/>
               <w:jc w:val="center"/>
               <w:rPr>
@@ -12933,6 +13145,7 @@
           </w:tcPr>
           <w:p>
             <w:pPr>
+              <w:spacing w:line="276" w:lineRule="auto"/>
               <w:ind w:firstLine="0"/>
               <w:rPr>
                 <w:rFonts w:eastAsia="MS Mincho"/>
@@ -12959,6 +13172,7 @@
     </w:tbl>
     <w:p>
       <w:pPr>
+        <w:spacing w:line="276" w:lineRule="auto"/>
         <w:rPr>
           <w:rFonts w:eastAsia="MS Mincho"/>
           <w:lang w:eastAsia="en-US"/>
@@ -13069,6 +13283,7 @@
     </w:p>
     <w:p>
       <w:pPr>
+        <w:spacing w:line="276" w:lineRule="auto"/>
         <w:ind w:firstLine="0"/>
         <w:rPr>
           <w:rFonts w:eastAsia="MS Mincho"/>
@@ -13089,15 +13304,7 @@
           <w:rFonts w:eastAsia="MS Mincho"/>
           <w:lang w:eastAsia="en-US"/>
         </w:rPr>
-        <w:t xml:space="preserve"> включает 10 дисциплин профессионального цикла направления «Информатика и вычислительная техника» (09.03.01) РТУ МИРЭА за 2024/2025 учебный год: «Технологии программирования», «Базы данных», «Веб-программирование», «Алгоритмы </w:t>
-      </w:r>
-      <w:r>
-        <w:rPr>
-          <w:rFonts w:eastAsia="MS Mincho"/>
-          <w:lang w:eastAsia="en-US"/>
-        </w:rPr>
-        <w:lastRenderedPageBreak/>
-        <w:t xml:space="preserve">и структуры данных», «Операционные системы» и др. </w:t>
+        <w:t xml:space="preserve"> включает 10 дисциплин профессионального цикла направления «Информатика и вычислительная техника» (09.03.01) РТУ МИРЭА за 2024/2025 учебный год: «Технологии программирования», «Базы данных», «Веб-программирование», «Алгоритмы и структуры данных», «Операционные системы» и др. </w:t>
       </w:r>
       <w:r>
         <w:rPr>
@@ -13113,7 +13320,15 @@
           <w:rFonts w:eastAsia="MS Mincho"/>
           <w:lang w:eastAsia="en-US"/>
         </w:rPr>
-        <w:t xml:space="preserve"> представлены рекомендациями проекта «ТОП-ИТ» (2025/2026 уч. год) — консенсусом ведущих ИТ-компаний (Яндекс, </w:t>
+        <w:t xml:space="preserve"> представлены рекомендациями проекта «ТОП-ИТ» (2025/2026 уч. год) </w:t>
+      </w:r>
+      <w:r>
+        <w:rPr>
+          <w:rFonts w:eastAsia="MS Mincho"/>
+          <w:lang w:eastAsia="en-US"/>
+        </w:rPr>
+        <w:lastRenderedPageBreak/>
+        <w:t xml:space="preserve">— консенсусом ведущих ИТ-компаний (Яндекс, </w:t>
       </w:r>
       <w:r>
         <w:rPr>
@@ -13232,6 +13447,7 @@
     </w:p>
     <w:p>
       <w:pPr>
+        <w:spacing w:line="276" w:lineRule="auto"/>
         <w:rPr>
           <w:rFonts w:eastAsia="MS Mincho"/>
           <w:lang w:eastAsia="en-US"/>
@@ -13256,23 +13472,7 @@
           <w:rFonts w:eastAsia="MS Mincho"/>
           <w:lang w:eastAsia="en-US"/>
         </w:rPr>
-        <w:t xml:space="preserve">-анализа с применением </w:t>
-      </w:r>
-      <w:proofErr w:type="spellStart"/>
-      <w:r>
-        <w:rPr>
-          <w:rFonts w:eastAsia="MS Mincho"/>
-          <w:lang w:eastAsia="en-US"/>
-        </w:rPr>
-        <w:t>токенизации</w:t>
-      </w:r>
-      <w:proofErr w:type="spellEnd"/>
-      <w:r>
-        <w:rPr>
-          <w:rFonts w:eastAsia="MS Mincho"/>
-          <w:lang w:eastAsia="en-US"/>
-        </w:rPr>
-        <w:t xml:space="preserve">, </w:t>
+        <w:t xml:space="preserve">-анализа с применением токенизации, </w:t>
       </w:r>
       <w:proofErr w:type="spellStart"/>
       <w:r>
@@ -14292,6 +14492,7 @@
     </w:p>
     <w:p>
       <w:pPr>
+        <w:spacing w:line="276" w:lineRule="auto"/>
         <w:rPr>
           <w:rFonts w:eastAsia="MS Mincho"/>
           <w:lang w:eastAsia="en-US"/>
@@ -14854,6 +15055,7 @@
     </w:p>
     <w:p>
       <w:pPr>
+        <w:spacing w:line="276" w:lineRule="auto"/>
         <w:rPr>
           <w:rFonts w:eastAsia="MS Mincho"/>
           <w:lang w:eastAsia="en-US"/>
@@ -15107,15 +15309,7 @@
           <w:rFonts w:eastAsia="MS Mincho"/>
           <w:lang w:eastAsia="en-US"/>
         </w:rPr>
-        <w:t xml:space="preserve">после каждого шага. Цикл ограничен тремя итерациями; </w:t>
-      </w:r>
-      <w:r>
-        <w:rPr>
-          <w:rFonts w:eastAsia="MS Mincho"/>
-          <w:lang w:eastAsia="en-US"/>
-        </w:rPr>
-        <w:lastRenderedPageBreak/>
-        <w:t xml:space="preserve">если после исчерпания набора правил конфликт остаётся высоким </w:t>
+        <w:t xml:space="preserve">после каждого шага. Цикл ограничен тремя итерациями; если после исчерпания набора правил конфликт остаётся высоким </w:t>
       </w:r>
       <m:oMath>
         <m:d>
@@ -15158,6 +15352,7 @@
     </w:p>
     <w:p>
       <w:pPr>
+        <w:spacing w:line="276" w:lineRule="auto"/>
         <w:rPr>
           <w:rFonts w:eastAsia="MS Mincho"/>
           <w:lang w:eastAsia="en-US"/>
@@ -15547,7 +15742,15 @@
           <w:rFonts w:eastAsia="MS Mincho"/>
           <w:lang w:eastAsia="en-US"/>
         </w:rPr>
-        <w:t xml:space="preserve">выполняется в сопоставимой шкале (например, через долю академических часов/тем/оценочных средств, отнесённых к кластеру), что обеспечивает корректность сравнения с </w:t>
+        <w:t xml:space="preserve">выполняется в сопоставимой шкале </w:t>
+      </w:r>
+      <w:r>
+        <w:rPr>
+          <w:rFonts w:eastAsia="MS Mincho"/>
+          <w:lang w:eastAsia="en-US"/>
+        </w:rPr>
+        <w:lastRenderedPageBreak/>
+        <w:t xml:space="preserve">(например, через долю академических часов/тем/оценочных средств, отнесённых к кластеру), что обеспечивает корректность сравнения с </w:t>
       </w:r>
       <m:oMath>
         <m:r>
@@ -15706,6 +15909,7 @@
     </w:p>
     <w:p>
       <w:pPr>
+        <w:spacing w:line="276" w:lineRule="auto"/>
         <w:rPr>
           <w:rFonts w:eastAsia="MS Mincho"/>
           <w:lang w:eastAsia="en-US"/>
@@ -16204,6 +16408,7 @@
     </w:p>
     <w:p>
       <w:pPr>
+        <w:spacing w:line="276" w:lineRule="auto"/>
         <w:rPr>
           <w:rFonts w:eastAsia="MS Mincho"/>
           <w:lang w:eastAsia="en-US"/>
@@ -16266,17 +16471,17 @@
     </w:p>
     <w:p>
       <w:pPr>
-        <w:rPr>
-          <w:rFonts w:eastAsia="MS Mincho"/>
-          <w:lang w:eastAsia="en-US"/>
-        </w:rPr>
-      </w:pPr>
-      <w:r>
-        <w:rPr>
-          <w:rFonts w:eastAsia="MS Mincho"/>
-          <w:lang w:eastAsia="en-US"/>
-        </w:rPr>
-        <w:lastRenderedPageBreak/>
+        <w:spacing w:line="276" w:lineRule="auto"/>
+        <w:rPr>
+          <w:rFonts w:eastAsia="MS Mincho"/>
+          <w:lang w:eastAsia="en-US"/>
+        </w:rPr>
+      </w:pPr>
+      <w:r>
+        <w:rPr>
+          <w:rFonts w:eastAsia="MS Mincho"/>
+          <w:lang w:eastAsia="en-US"/>
+        </w:rPr>
         <w:t xml:space="preserve">Подсистема хранения данных реализована на СУБД </w:t>
       </w:r>
       <w:proofErr w:type="spellStart"/>
@@ -16314,6 +16519,7 @@
     </w:p>
     <w:p>
       <w:pPr>
+        <w:spacing w:line="276" w:lineRule="auto"/>
         <w:rPr>
           <w:rFonts w:eastAsia="MS Mincho"/>
           <w:lang w:eastAsia="en-US"/>
@@ -16374,6 +16580,7 @@
     <w:p>
       <w:pPr>
         <w:pStyle w:val="2"/>
+        <w:spacing w:line="276" w:lineRule="auto"/>
         <w:rPr>
           <w:rFonts w:eastAsia="MS Gothic"/>
           <w:lang w:val="ru-RU" w:eastAsia="en-US"/>
@@ -16396,16 +16603,18 @@
     </w:p>
     <w:p>
       <w:pPr>
-        <w:rPr>
-          <w:rFonts w:eastAsia="MS Mincho"/>
-          <w:lang w:eastAsia="en-US"/>
-        </w:rPr>
-      </w:pPr>
-      <w:r>
-        <w:rPr>
-          <w:rFonts w:eastAsia="MS Mincho"/>
-          <w:lang w:eastAsia="en-US"/>
-        </w:rPr>
+        <w:spacing w:line="276" w:lineRule="auto"/>
+        <w:rPr>
+          <w:rFonts w:eastAsia="MS Mincho"/>
+          <w:lang w:eastAsia="en-US"/>
+        </w:rPr>
+      </w:pPr>
+      <w:r>
+        <w:rPr>
+          <w:rFonts w:eastAsia="MS Mincho"/>
+          <w:lang w:eastAsia="en-US"/>
+        </w:rPr>
+        <w:lastRenderedPageBreak/>
         <w:t xml:space="preserve">Корректность функционирования разработанной методики определяется согласованной настройкой параметров двух последовательных контуров принятия решений (рис. 2): уровня 1 (агрегация свидетельств по кластерам компетенций </w:t>
       </w:r>
       <m:oMath>
@@ -16607,6 +16816,7 @@
     </w:p>
     <w:p>
       <w:pPr>
+        <w:spacing w:line="276" w:lineRule="auto"/>
         <w:ind w:firstLine="0"/>
         <w:jc w:val="center"/>
         <w:rPr>
@@ -16628,6 +16838,7 @@
     </w:p>
     <w:p>
       <w:pPr>
+        <w:spacing w:line="276" w:lineRule="auto"/>
         <w:rPr>
           <w:rFonts w:eastAsia="MS Mincho"/>
           <w:lang w:eastAsia="en-US"/>
@@ -16970,6 +17181,7 @@
     </w:p>
     <w:p>
       <w:pPr>
+        <w:spacing w:line="276" w:lineRule="auto"/>
         <w:rPr>
           <w:rFonts w:eastAsia="MS Mincho"/>
           <w:lang w:eastAsia="en-US"/>
@@ -17031,15 +17243,7 @@
           <w:rFonts w:eastAsia="MS Mincho"/>
           <w:lang w:eastAsia="en-US"/>
         </w:rPr>
-        <w:t xml:space="preserve">отражает высокую оперативность данных рынка труда при учёте возможных искажений: неполнота и ошибки в описаниях вакансий, несоответствие заявленных требований фактическим обязанностям, </w:t>
-      </w:r>
-      <w:r>
-        <w:rPr>
-          <w:rFonts w:eastAsia="MS Mincho"/>
-          <w:lang w:eastAsia="en-US"/>
-        </w:rPr>
-        <w:lastRenderedPageBreak/>
-        <w:t xml:space="preserve">дубликаты и устаревание объявлений. Коэффициент </w:t>
+        <w:t xml:space="preserve">отражает высокую оперативность данных рынка труда при учёте возможных искажений: неполнота и ошибки в описаниях вакансий, несоответствие заявленных требований фактическим обязанностям, дубликаты и устаревание объявлений. Коэффициент </w:t>
       </w:r>
       <m:oMath>
         <m:sSub>
@@ -17146,6 +17350,7 @@
     </w:p>
     <w:p>
       <w:pPr>
+        <w:spacing w:line="276" w:lineRule="auto"/>
         <w:rPr>
           <w:rFonts w:eastAsia="MS Mincho"/>
           <w:lang w:eastAsia="en-US"/>
@@ -17279,6 +17484,7 @@
     </w:p>
     <w:p>
       <w:pPr>
+        <w:spacing w:line="276" w:lineRule="auto"/>
         <w:rPr>
           <w:rFonts w:eastAsia="MS Mincho"/>
           <w:i/>
@@ -17298,6 +17504,7 @@
     </w:p>
     <w:p>
       <w:pPr>
+        <w:spacing w:line="276" w:lineRule="auto"/>
         <w:rPr>
           <w:rFonts w:eastAsia="MS Mincho"/>
           <w:lang w:eastAsia="en-US"/>
@@ -17609,7 +17816,15 @@
           <w:rFonts w:eastAsia="MS Mincho"/>
           <w:lang w:eastAsia="en-US"/>
         </w:rPr>
-        <w:t>обеспечивало компромисс между полнотой выявления дефицитов и практической реализуемостью обновлений</w:t>
+        <w:t xml:space="preserve">обеспечивало компромисс между полнотой выявления дефицитов и практической </w:t>
+      </w:r>
+      <w:r>
+        <w:rPr>
+          <w:rFonts w:eastAsia="MS Mincho"/>
+          <w:lang w:eastAsia="en-US"/>
+        </w:rPr>
+        <w:lastRenderedPageBreak/>
+        <w:t>реализуемостью обновлений</w:t>
       </w:r>
       <w:r>
         <w:rPr>
@@ -17832,6 +18047,7 @@
     </w:p>
     <w:p>
       <w:pPr>
+        <w:spacing w:line="276" w:lineRule="auto"/>
         <w:rPr>
           <w:rFonts w:eastAsia="MS Mincho"/>
           <w:lang w:eastAsia="en-US"/>
@@ -18105,19 +18321,12 @@
           <w:rFonts w:eastAsia="MS Mincho"/>
           <w:lang w:eastAsia="en-US"/>
         </w:rPr>
-        <w:t xml:space="preserve"> </w:t>
-      </w:r>
-      <w:r>
-        <w:rPr>
-          <w:rFonts w:eastAsia="MS Mincho"/>
-          <w:lang w:eastAsia="en-US"/>
-        </w:rPr>
-        <w:lastRenderedPageBreak/>
-        <w:t>размах [0.18; 0.35]), что подтверждает приемлемую согласованность источников по большинству кластеров.</w:t>
+        <w:t xml:space="preserve"> размах [0.18; 0.35]), что подтверждает приемлемую согласованность источников по большинству кластеров.</w:t>
       </w:r>
     </w:p>
     <w:p>
       <w:pPr>
+        <w:spacing w:line="276" w:lineRule="auto"/>
         <w:rPr>
           <w:rFonts w:eastAsia="MS Mincho"/>
           <w:lang w:eastAsia="en-US"/>
@@ -18321,6 +18530,7 @@
     </w:p>
     <w:p>
       <w:pPr>
+        <w:spacing w:line="276" w:lineRule="auto"/>
         <w:rPr>
           <w:rFonts w:eastAsia="MS Mincho"/>
           <w:i/>
@@ -18340,6 +18550,7 @@
     </w:p>
     <w:p>
       <w:pPr>
+        <w:spacing w:line="276" w:lineRule="auto"/>
         <w:rPr>
           <w:rFonts w:eastAsia="MS Mincho"/>
           <w:lang w:eastAsia="en-US"/>
@@ -18843,6 +19054,7 @@
     </w:p>
     <w:p>
       <w:pPr>
+        <w:spacing w:line="276" w:lineRule="auto"/>
         <w:rPr>
           <w:rFonts w:eastAsia="MS Mincho"/>
           <w:lang w:eastAsia="en-US"/>
@@ -18872,6 +19084,7 @@
     </w:p>
     <w:p>
       <w:pPr>
+        <w:spacing w:line="276" w:lineRule="auto"/>
         <w:rPr>
           <w:rFonts w:eastAsia="MS Mincho"/>
           <w:lang w:eastAsia="en-US"/>
@@ -18919,13 +19132,13 @@
           </w:tcPr>
           <w:p>
             <w:pPr>
+              <w:spacing w:line="276" w:lineRule="auto"/>
               <w:ind w:firstLine="0"/>
               <w:jc w:val="center"/>
               <w:rPr>
                 <w:rFonts w:eastAsia="MS Gothic"/>
                 <w:b/>
                 <w:bCs/>
-                <w:sz w:val="24"/>
                 <w:szCs w:val="24"/>
                 <w:lang w:val="en-US" w:eastAsia="en-US"/>
               </w:rPr>
@@ -18936,7 +19149,6 @@
                 <w:rFonts w:eastAsia="MS Gothic"/>
                 <w:b/>
                 <w:bCs/>
-                <w:sz w:val="24"/>
                 <w:szCs w:val="24"/>
                 <w:lang w:val="en-US" w:eastAsia="en-US"/>
               </w:rPr>
@@ -18952,13 +19164,13 @@
           </w:tcPr>
           <w:p>
             <w:pPr>
+              <w:spacing w:line="276" w:lineRule="auto"/>
               <w:ind w:firstLine="0"/>
               <w:jc w:val="center"/>
               <w:rPr>
                 <w:rFonts w:eastAsia="MS Gothic"/>
                 <w:b/>
                 <w:bCs/>
-                <w:sz w:val="24"/>
                 <w:szCs w:val="24"/>
                 <w:lang w:val="en-US" w:eastAsia="en-US"/>
               </w:rPr>
@@ -18968,7 +19180,6 @@
                 <w:rFonts w:eastAsia="MS Gothic"/>
                 <w:b/>
                 <w:bCs/>
-                <w:sz w:val="24"/>
                 <w:szCs w:val="24"/>
                 <w:lang w:val="en-US" w:eastAsia="en-US"/>
               </w:rPr>
@@ -18983,13 +19194,13 @@
           </w:tcPr>
           <w:p>
             <w:pPr>
+              <w:spacing w:line="276" w:lineRule="auto"/>
               <w:ind w:firstLine="0"/>
               <w:jc w:val="center"/>
               <w:rPr>
                 <w:rFonts w:eastAsia="MS Gothic"/>
                 <w:b/>
                 <w:bCs/>
-                <w:sz w:val="24"/>
                 <w:szCs w:val="24"/>
                 <w:lang w:val="en-US" w:eastAsia="en-US"/>
               </w:rPr>
@@ -19000,7 +19211,6 @@
                 <w:rFonts w:eastAsia="MS Gothic"/>
                 <w:b/>
                 <w:bCs/>
-                <w:sz w:val="24"/>
                 <w:szCs w:val="24"/>
                 <w:lang w:val="en-US" w:eastAsia="en-US"/>
               </w:rPr>
@@ -19012,7 +19222,6 @@
                 <w:rFonts w:eastAsia="MS Gothic"/>
                 <w:b/>
                 <w:bCs/>
-                <w:sz w:val="24"/>
                 <w:szCs w:val="24"/>
                 <w:lang w:val="en-US" w:eastAsia="en-US"/>
               </w:rPr>
@@ -19024,7 +19233,6 @@
                 <w:rFonts w:eastAsia="MS Gothic"/>
                 <w:b/>
                 <w:bCs/>
-                <w:sz w:val="24"/>
                 <w:szCs w:val="24"/>
                 <w:lang w:val="en-US" w:eastAsia="en-US"/>
               </w:rPr>
@@ -19040,13 +19248,13 @@
           </w:tcPr>
           <w:p>
             <w:pPr>
+              <w:spacing w:line="276" w:lineRule="auto"/>
               <w:ind w:firstLine="0"/>
               <w:jc w:val="center"/>
               <w:rPr>
                 <w:rFonts w:eastAsia="MS Gothic"/>
                 <w:b/>
                 <w:bCs/>
-                <w:sz w:val="24"/>
                 <w:szCs w:val="24"/>
                 <w:lang w:val="en-US" w:eastAsia="en-US"/>
               </w:rPr>
@@ -19057,7 +19265,6 @@
                 <w:rFonts w:eastAsia="MS Gothic"/>
                 <w:b/>
                 <w:bCs/>
-                <w:sz w:val="24"/>
                 <w:szCs w:val="24"/>
                 <w:lang w:val="en-US" w:eastAsia="en-US"/>
               </w:rPr>
@@ -19075,13 +19282,13 @@
           </w:tcPr>
           <w:p>
             <w:pPr>
+              <w:spacing w:line="276" w:lineRule="auto"/>
               <w:ind w:firstLine="0"/>
               <w:jc w:val="left"/>
               <w:rPr>
                 <w:rFonts w:eastAsia="MS Gothic"/>
                 <w:b/>
                 <w:bCs/>
-                <w:sz w:val="24"/>
                 <w:szCs w:val="24"/>
                 <w:lang w:val="en-US" w:eastAsia="en-US"/>
               </w:rPr>
@@ -19096,7 +19303,6 @@
                         <w:b/>
                         <w:bCs/>
                         <w:i/>
-                        <w:sz w:val="24"/>
                         <w:szCs w:val="24"/>
                         <w:lang w:val="en-US" w:eastAsia="en-US"/>
                       </w:rPr>
@@ -19109,7 +19315,6 @@
                       </m:rPr>
                       <w:rPr>
                         <w:rFonts w:ascii="Cambria Math" w:eastAsia="MS Gothic" w:hAnsi="Cambria Math"/>
-                        <w:sz w:val="24"/>
                         <w:szCs w:val="24"/>
                         <w:lang w:val="en-US" w:eastAsia="en-US"/>
                       </w:rPr>
@@ -19123,7 +19328,6 @@
                       </m:rPr>
                       <w:rPr>
                         <w:rFonts w:ascii="Cambria Math" w:eastAsia="MS Gothic" w:hAnsi="Cambria Math"/>
-                        <w:sz w:val="24"/>
                         <w:szCs w:val="24"/>
                         <w:lang w:val="en-US" w:eastAsia="en-US"/>
                       </w:rPr>
@@ -19142,11 +19346,11 @@
           </w:tcPr>
           <w:p>
             <w:pPr>
+              <w:spacing w:line="276" w:lineRule="auto"/>
               <w:ind w:firstLine="0"/>
               <w:jc w:val="left"/>
               <w:rPr>
                 <w:rFonts w:eastAsia="MS Mincho"/>
-                <w:sz w:val="24"/>
                 <w:szCs w:val="24"/>
                 <w:lang w:val="en-US" w:eastAsia="en-US"/>
               </w:rPr>
@@ -19154,7 +19358,6 @@
             <w:r>
               <w:rPr>
                 <w:rFonts w:eastAsia="MS Mincho"/>
-                <w:sz w:val="24"/>
                 <w:szCs w:val="24"/>
                 <w:lang w:val="en-US" w:eastAsia="en-US"/>
               </w:rPr>
@@ -19169,11 +19372,11 @@
           </w:tcPr>
           <w:p>
             <w:pPr>
+              <w:spacing w:line="276" w:lineRule="auto"/>
               <w:ind w:firstLine="0"/>
               <w:jc w:val="left"/>
               <w:rPr>
                 <w:rFonts w:eastAsia="MS Mincho"/>
-                <w:sz w:val="24"/>
                 <w:szCs w:val="24"/>
                 <w:lang w:val="en-US" w:eastAsia="en-US"/>
               </w:rPr>
@@ -19182,7 +19385,6 @@
             <w:r>
               <w:rPr>
                 <w:rFonts w:eastAsia="MS Mincho"/>
-                <w:sz w:val="24"/>
                 <w:szCs w:val="24"/>
                 <w:lang w:val="en-US" w:eastAsia="en-US"/>
               </w:rPr>
@@ -19192,7 +19394,6 @@
             <w:r>
               <w:rPr>
                 <w:rFonts w:eastAsia="MS Mincho"/>
-                <w:sz w:val="24"/>
                 <w:szCs w:val="24"/>
                 <w:lang w:val="en-US" w:eastAsia="en-US"/>
               </w:rPr>
@@ -19202,7 +19403,6 @@
             <w:r>
               <w:rPr>
                 <w:rFonts w:eastAsia="MS Mincho"/>
-                <w:sz w:val="24"/>
                 <w:szCs w:val="24"/>
                 <w:lang w:val="en-US" w:eastAsia="en-US"/>
               </w:rPr>
@@ -19212,7 +19412,6 @@
             <w:r>
               <w:rPr>
                 <w:rFonts w:eastAsia="MS Mincho"/>
-                <w:sz w:val="24"/>
                 <w:szCs w:val="24"/>
                 <w:lang w:val="en-US" w:eastAsia="en-US"/>
               </w:rPr>
@@ -19222,7 +19421,6 @@
             <w:r>
               <w:rPr>
                 <w:rFonts w:eastAsia="MS Mincho"/>
-                <w:sz w:val="24"/>
                 <w:szCs w:val="24"/>
                 <w:lang w:val="en-US" w:eastAsia="en-US"/>
               </w:rPr>
@@ -19238,11 +19436,11 @@
           </w:tcPr>
           <w:p>
             <w:pPr>
+              <w:spacing w:line="276" w:lineRule="auto"/>
               <w:ind w:firstLine="0"/>
               <w:jc w:val="left"/>
               <w:rPr>
                 <w:rFonts w:eastAsia="MS Mincho"/>
-                <w:sz w:val="24"/>
                 <w:szCs w:val="24"/>
                 <w:lang w:eastAsia="en-US"/>
               </w:rPr>
@@ -19250,7 +19448,6 @@
             <w:r>
               <w:rPr>
                 <w:rFonts w:eastAsia="MS Mincho"/>
-                <w:sz w:val="24"/>
                 <w:szCs w:val="24"/>
                 <w:lang w:eastAsia="en-US"/>
               </w:rPr>
@@ -19267,13 +19464,13 @@
           </w:tcPr>
           <w:p>
             <w:pPr>
+              <w:spacing w:line="276" w:lineRule="auto"/>
               <w:ind w:firstLine="0"/>
               <w:jc w:val="left"/>
               <w:rPr>
                 <w:rFonts w:eastAsia="MS Gothic"/>
                 <w:b/>
                 <w:bCs/>
-                <w:sz w:val="24"/>
                 <w:szCs w:val="24"/>
                 <w:lang w:val="en-US" w:eastAsia="en-US"/>
               </w:rPr>
@@ -19288,7 +19485,6 @@
                         <w:b/>
                         <w:bCs/>
                         <w:i/>
-                        <w:sz w:val="24"/>
                         <w:szCs w:val="24"/>
                         <w:lang w:val="en-US" w:eastAsia="en-US"/>
                       </w:rPr>
@@ -19301,7 +19497,6 @@
                       </m:rPr>
                       <w:rPr>
                         <w:rFonts w:ascii="Cambria Math" w:eastAsia="MS Gothic" w:hAnsi="Cambria Math"/>
-                        <w:sz w:val="24"/>
                         <w:szCs w:val="24"/>
                         <w:lang w:val="en-US" w:eastAsia="en-US"/>
                       </w:rPr>
@@ -19315,7 +19510,6 @@
                       </m:rPr>
                       <w:rPr>
                         <w:rFonts w:ascii="Cambria Math" w:eastAsia="MS Gothic" w:hAnsi="Cambria Math"/>
-                        <w:sz w:val="24"/>
                         <w:szCs w:val="24"/>
                         <w:lang w:val="en-US" w:eastAsia="en-US"/>
                       </w:rPr>
@@ -19334,11 +19528,11 @@
           </w:tcPr>
           <w:p>
             <w:pPr>
+              <w:spacing w:line="276" w:lineRule="auto"/>
               <w:ind w:firstLine="0"/>
               <w:jc w:val="left"/>
               <w:rPr>
                 <w:rFonts w:eastAsia="MS Mincho"/>
-                <w:sz w:val="24"/>
                 <w:szCs w:val="24"/>
                 <w:lang w:val="en-US" w:eastAsia="en-US"/>
               </w:rPr>
@@ -19346,7 +19540,6 @@
             <w:r>
               <w:rPr>
                 <w:rFonts w:eastAsia="MS Mincho"/>
-                <w:sz w:val="24"/>
                 <w:szCs w:val="24"/>
                 <w:lang w:val="en-US" w:eastAsia="en-US"/>
               </w:rPr>
@@ -19361,11 +19554,11 @@
           </w:tcPr>
           <w:p>
             <w:pPr>
+              <w:spacing w:line="276" w:lineRule="auto"/>
               <w:ind w:firstLine="0"/>
               <w:jc w:val="left"/>
               <w:rPr>
                 <w:rFonts w:eastAsia="MS Mincho"/>
-                <w:sz w:val="24"/>
                 <w:szCs w:val="24"/>
                 <w:lang w:val="en-US" w:eastAsia="en-US"/>
               </w:rPr>
@@ -19374,7 +19567,6 @@
             <w:r>
               <w:rPr>
                 <w:rFonts w:eastAsia="MS Mincho"/>
-                <w:sz w:val="24"/>
                 <w:szCs w:val="24"/>
                 <w:lang w:val="en-US" w:eastAsia="en-US"/>
               </w:rPr>
@@ -19384,7 +19576,6 @@
             <w:r>
               <w:rPr>
                 <w:rFonts w:eastAsia="MS Mincho"/>
-                <w:sz w:val="24"/>
                 <w:szCs w:val="24"/>
                 <w:lang w:val="en-US" w:eastAsia="en-US"/>
               </w:rPr>
@@ -19394,7 +19585,6 @@
             <w:r>
               <w:rPr>
                 <w:rFonts w:eastAsia="MS Mincho"/>
-                <w:sz w:val="24"/>
                 <w:szCs w:val="24"/>
                 <w:lang w:val="en-US" w:eastAsia="en-US"/>
               </w:rPr>
@@ -19404,7 +19594,6 @@
             <w:r>
               <w:rPr>
                 <w:rFonts w:eastAsia="MS Mincho"/>
-                <w:sz w:val="24"/>
                 <w:szCs w:val="24"/>
                 <w:lang w:val="en-US" w:eastAsia="en-US"/>
               </w:rPr>
@@ -19414,7 +19603,6 @@
             <w:r>
               <w:rPr>
                 <w:rFonts w:eastAsia="MS Mincho"/>
-                <w:sz w:val="24"/>
                 <w:szCs w:val="24"/>
                 <w:lang w:val="en-US" w:eastAsia="en-US"/>
               </w:rPr>
@@ -19430,11 +19618,11 @@
           </w:tcPr>
           <w:p>
             <w:pPr>
+              <w:spacing w:line="276" w:lineRule="auto"/>
               <w:ind w:firstLine="0"/>
               <w:jc w:val="left"/>
               <w:rPr>
                 <w:rFonts w:eastAsia="MS Mincho"/>
-                <w:sz w:val="24"/>
                 <w:szCs w:val="24"/>
                 <w:lang w:eastAsia="en-US"/>
               </w:rPr>
@@ -19442,7 +19630,6 @@
             <w:r>
               <w:rPr>
                 <w:rFonts w:eastAsia="MS Mincho"/>
-                <w:sz w:val="24"/>
                 <w:szCs w:val="24"/>
                 <w:lang w:eastAsia="en-US"/>
               </w:rPr>
@@ -19459,13 +19646,13 @@
           </w:tcPr>
           <w:p>
             <w:pPr>
+              <w:spacing w:line="276" w:lineRule="auto"/>
               <w:ind w:firstLine="0"/>
               <w:jc w:val="left"/>
               <w:rPr>
                 <w:rFonts w:eastAsia="MS Gothic"/>
                 <w:b/>
                 <w:bCs/>
-                <w:sz w:val="24"/>
                 <w:szCs w:val="24"/>
                 <w:lang w:val="en-US" w:eastAsia="en-US"/>
               </w:rPr>
@@ -19480,7 +19667,6 @@
                         <w:b/>
                         <w:bCs/>
                         <w:i/>
-                        <w:sz w:val="24"/>
                         <w:szCs w:val="24"/>
                         <w:lang w:val="en-US" w:eastAsia="en-US"/>
                       </w:rPr>
@@ -19493,7 +19679,6 @@
                       </m:rPr>
                       <w:rPr>
                         <w:rFonts w:ascii="Cambria Math" w:eastAsia="MS Gothic" w:hAnsi="Cambria Math"/>
-                        <w:sz w:val="24"/>
                         <w:szCs w:val="24"/>
                         <w:lang w:val="en-US" w:eastAsia="en-US"/>
                       </w:rPr>
@@ -19507,7 +19692,6 @@
                       </m:rPr>
                       <w:rPr>
                         <w:rFonts w:ascii="Cambria Math" w:eastAsia="MS Gothic" w:hAnsi="Cambria Math"/>
-                        <w:sz w:val="24"/>
                         <w:szCs w:val="24"/>
                         <w:lang w:val="en-US" w:eastAsia="en-US"/>
                       </w:rPr>
@@ -19526,11 +19710,11 @@
           </w:tcPr>
           <w:p>
             <w:pPr>
+              <w:spacing w:line="276" w:lineRule="auto"/>
               <w:ind w:firstLine="0"/>
               <w:jc w:val="left"/>
               <w:rPr>
                 <w:rFonts w:eastAsia="MS Mincho"/>
-                <w:sz w:val="24"/>
                 <w:szCs w:val="24"/>
                 <w:lang w:val="en-US" w:eastAsia="en-US"/>
               </w:rPr>
@@ -19538,7 +19722,6 @@
             <w:r>
               <w:rPr>
                 <w:rFonts w:eastAsia="MS Mincho"/>
-                <w:sz w:val="24"/>
                 <w:szCs w:val="24"/>
                 <w:lang w:val="en-US" w:eastAsia="en-US"/>
               </w:rPr>
@@ -19553,11 +19736,11 @@
           </w:tcPr>
           <w:p>
             <w:pPr>
+              <w:spacing w:line="276" w:lineRule="auto"/>
               <w:ind w:firstLine="0"/>
               <w:jc w:val="left"/>
               <w:rPr>
                 <w:rFonts w:eastAsia="MS Mincho"/>
-                <w:sz w:val="24"/>
                 <w:szCs w:val="24"/>
                 <w:lang w:val="en-US" w:eastAsia="en-US"/>
               </w:rPr>
@@ -19566,7 +19749,6 @@
             <w:r>
               <w:rPr>
                 <w:rFonts w:eastAsia="MS Mincho"/>
-                <w:sz w:val="24"/>
                 <w:szCs w:val="24"/>
                 <w:lang w:val="en-US" w:eastAsia="en-US"/>
               </w:rPr>
@@ -19576,7 +19758,6 @@
             <w:r>
               <w:rPr>
                 <w:rFonts w:eastAsia="MS Mincho"/>
-                <w:sz w:val="24"/>
                 <w:szCs w:val="24"/>
                 <w:lang w:val="en-US" w:eastAsia="en-US"/>
               </w:rPr>
@@ -19586,7 +19767,6 @@
             <w:r>
               <w:rPr>
                 <w:rFonts w:eastAsia="MS Mincho"/>
-                <w:sz w:val="24"/>
                 <w:szCs w:val="24"/>
                 <w:lang w:val="en-US" w:eastAsia="en-US"/>
               </w:rPr>
@@ -19596,7 +19776,6 @@
             <w:r>
               <w:rPr>
                 <w:rFonts w:eastAsia="MS Mincho"/>
-                <w:sz w:val="24"/>
                 <w:szCs w:val="24"/>
                 <w:lang w:val="en-US" w:eastAsia="en-US"/>
               </w:rPr>
@@ -19606,7 +19785,6 @@
             <w:r>
               <w:rPr>
                 <w:rFonts w:eastAsia="MS Mincho"/>
-                <w:sz w:val="24"/>
                 <w:szCs w:val="24"/>
                 <w:lang w:val="en-US" w:eastAsia="en-US"/>
               </w:rPr>
@@ -19622,11 +19800,11 @@
           </w:tcPr>
           <w:p>
             <w:pPr>
+              <w:spacing w:line="276" w:lineRule="auto"/>
               <w:ind w:firstLine="0"/>
               <w:jc w:val="left"/>
               <w:rPr>
                 <w:rFonts w:eastAsia="MS Mincho"/>
-                <w:sz w:val="24"/>
                 <w:szCs w:val="24"/>
                 <w:lang w:eastAsia="en-US"/>
               </w:rPr>
@@ -19634,7 +19812,6 @@
             <w:r>
               <w:rPr>
                 <w:rFonts w:eastAsia="MS Mincho"/>
-                <w:sz w:val="24"/>
                 <w:szCs w:val="24"/>
                 <w:lang w:eastAsia="en-US"/>
               </w:rPr>
@@ -19651,13 +19828,13 @@
           </w:tcPr>
           <w:p>
             <w:pPr>
+              <w:spacing w:line="276" w:lineRule="auto"/>
               <w:ind w:firstLine="0"/>
               <w:jc w:val="left"/>
               <w:rPr>
                 <w:rFonts w:eastAsia="MS Gothic"/>
                 <w:b/>
                 <w:bCs/>
-                <w:sz w:val="24"/>
                 <w:szCs w:val="24"/>
                 <w:lang w:val="en-US" w:eastAsia="en-US"/>
               </w:rPr>
@@ -19671,7 +19848,6 @@
                       <w:b/>
                       <w:bCs/>
                       <w:i/>
-                      <w:sz w:val="24"/>
                       <w:szCs w:val="24"/>
                       <w:lang w:val="en-US" w:eastAsia="en-US"/>
                     </w:rPr>
@@ -19684,7 +19860,6 @@
                     </m:rPr>
                     <w:rPr>
                       <w:rFonts w:ascii="Cambria Math" w:eastAsia="MS Gothic" w:hAnsi="Cambria Math"/>
-                      <w:sz w:val="24"/>
                       <w:szCs w:val="24"/>
                       <w:lang w:val="en-US" w:eastAsia="en-US"/>
                     </w:rPr>
@@ -19698,7 +19873,6 @@
                     </m:rPr>
                     <w:rPr>
                       <w:rFonts w:ascii="Cambria Math" w:eastAsia="MS Gothic" w:hAnsi="Cambria Math"/>
-                      <w:sz w:val="24"/>
                       <w:szCs w:val="24"/>
                       <w:lang w:val="en-US" w:eastAsia="en-US"/>
                     </w:rPr>
@@ -19712,7 +19886,6 @@
                 <w:rFonts w:eastAsia="MS Gothic"/>
                 <w:b/>
                 <w:bCs/>
-                <w:sz w:val="24"/>
                 <w:szCs w:val="24"/>
                 <w:lang w:val="en-US" w:eastAsia="en-US"/>
               </w:rPr>
@@ -19721,7 +19894,6 @@
             <w:r>
               <w:rPr>
                 <w:rFonts w:eastAsia="MS Gothic"/>
-                <w:sz w:val="24"/>
                 <w:szCs w:val="24"/>
                 <w:lang w:val="en-US" w:eastAsia="en-US"/>
               </w:rPr>
@@ -19731,7 +19903,6 @@
             <w:r>
               <w:rPr>
                 <w:rFonts w:eastAsia="MS Gothic"/>
-                <w:sz w:val="24"/>
                 <w:szCs w:val="24"/>
                 <w:lang w:val="en-US" w:eastAsia="en-US"/>
               </w:rPr>
@@ -19741,7 +19912,6 @@
             <w:r>
               <w:rPr>
                 <w:rFonts w:eastAsia="MS Gothic"/>
-                <w:sz w:val="24"/>
                 <w:szCs w:val="24"/>
                 <w:lang w:val="en-US" w:eastAsia="en-US"/>
               </w:rPr>
@@ -19751,7 +19921,6 @@
             <w:r>
               <w:rPr>
                 <w:rFonts w:eastAsia="MS Gothic"/>
-                <w:sz w:val="24"/>
                 <w:szCs w:val="24"/>
                 <w:lang w:val="en-US" w:eastAsia="en-US"/>
               </w:rPr>
@@ -19761,7 +19930,6 @@
             <w:r>
               <w:rPr>
                 <w:rFonts w:eastAsia="MS Gothic"/>
-                <w:sz w:val="24"/>
                 <w:szCs w:val="24"/>
                 <w:lang w:val="en-US" w:eastAsia="en-US"/>
               </w:rPr>
@@ -19776,11 +19944,11 @@
           </w:tcPr>
           <w:p>
             <w:pPr>
+              <w:spacing w:line="276" w:lineRule="auto"/>
               <w:ind w:firstLine="0"/>
               <w:jc w:val="left"/>
               <w:rPr>
                 <w:rFonts w:eastAsia="MS Mincho"/>
-                <w:sz w:val="24"/>
                 <w:szCs w:val="24"/>
                 <w:lang w:val="en-US" w:eastAsia="en-US"/>
               </w:rPr>
@@ -19788,7 +19956,6 @@
             <w:r>
               <w:rPr>
                 <w:rFonts w:eastAsia="MS Mincho"/>
-                <w:sz w:val="24"/>
                 <w:szCs w:val="24"/>
                 <w:lang w:val="en-US" w:eastAsia="en-US"/>
               </w:rPr>
@@ -19803,11 +19970,11 @@
           </w:tcPr>
           <w:p>
             <w:pPr>
+              <w:spacing w:line="276" w:lineRule="auto"/>
               <w:ind w:firstLine="0"/>
               <w:jc w:val="left"/>
               <w:rPr>
                 <w:rFonts w:eastAsia="MS Mincho"/>
-                <w:sz w:val="24"/>
                 <w:szCs w:val="24"/>
                 <w:lang w:val="en-US" w:eastAsia="en-US"/>
               </w:rPr>
@@ -19816,7 +19983,6 @@
             <w:r>
               <w:rPr>
                 <w:rFonts w:eastAsia="MS Mincho"/>
-                <w:sz w:val="24"/>
                 <w:szCs w:val="24"/>
                 <w:lang w:val="en-US" w:eastAsia="en-US"/>
               </w:rPr>
@@ -19826,7 +19992,6 @@
             <w:r>
               <w:rPr>
                 <w:rFonts w:eastAsia="MS Mincho"/>
-                <w:sz w:val="24"/>
                 <w:szCs w:val="24"/>
                 <w:lang w:val="en-US" w:eastAsia="en-US"/>
               </w:rPr>
@@ -19836,7 +20001,6 @@
             <w:r>
               <w:rPr>
                 <w:rFonts w:eastAsia="MS Mincho"/>
-                <w:sz w:val="24"/>
                 <w:szCs w:val="24"/>
                 <w:lang w:val="en-US" w:eastAsia="en-US"/>
               </w:rPr>
@@ -19846,7 +20010,6 @@
             <w:r>
               <w:rPr>
                 <w:rFonts w:eastAsia="MS Mincho"/>
-                <w:sz w:val="24"/>
                 <w:szCs w:val="24"/>
                 <w:lang w:val="en-US" w:eastAsia="en-US"/>
               </w:rPr>
@@ -19856,7 +20019,6 @@
             <w:r>
               <w:rPr>
                 <w:rFonts w:eastAsia="MS Mincho"/>
-                <w:sz w:val="24"/>
                 <w:szCs w:val="24"/>
                 <w:lang w:val="en-US" w:eastAsia="en-US"/>
               </w:rPr>
@@ -19866,7 +20028,6 @@
             <w:r>
               <w:rPr>
                 <w:rFonts w:eastAsia="MS Mincho"/>
-                <w:sz w:val="24"/>
                 <w:szCs w:val="24"/>
                 <w:lang w:val="en-US" w:eastAsia="en-US"/>
               </w:rPr>
@@ -19876,7 +20037,6 @@
             <w:r>
               <w:rPr>
                 <w:rFonts w:eastAsia="MS Mincho"/>
-                <w:sz w:val="24"/>
                 <w:szCs w:val="24"/>
                 <w:lang w:val="en-US" w:eastAsia="en-US"/>
               </w:rPr>
@@ -19892,11 +20052,11 @@
           </w:tcPr>
           <w:p>
             <w:pPr>
+              <w:spacing w:line="276" w:lineRule="auto"/>
               <w:ind w:firstLine="0"/>
               <w:jc w:val="left"/>
               <w:rPr>
                 <w:rFonts w:eastAsia="MS Mincho"/>
-                <w:sz w:val="24"/>
                 <w:szCs w:val="24"/>
                 <w:lang w:eastAsia="en-US"/>
               </w:rPr>
@@ -19904,7 +20064,6 @@
             <w:r>
               <w:rPr>
                 <w:rFonts w:eastAsia="MS Mincho"/>
-                <w:sz w:val="24"/>
                 <w:szCs w:val="24"/>
                 <w:lang w:eastAsia="en-US"/>
               </w:rPr>
@@ -19921,13 +20080,13 @@
           </w:tcPr>
           <w:p>
             <w:pPr>
+              <w:spacing w:line="276" w:lineRule="auto"/>
               <w:ind w:firstLine="0"/>
               <w:jc w:val="left"/>
               <w:rPr>
                 <w:rFonts w:eastAsia="MS Gothic"/>
                 <w:b/>
                 <w:bCs/>
-                <w:sz w:val="24"/>
                 <w:szCs w:val="24"/>
                 <w:lang w:val="en-US" w:eastAsia="en-US"/>
               </w:rPr>
@@ -19941,7 +20100,6 @@
                       <w:b/>
                       <w:bCs/>
                       <w:i/>
-                      <w:sz w:val="24"/>
                       <w:szCs w:val="24"/>
                       <w:lang w:val="en-US" w:eastAsia="en-US"/>
                     </w:rPr>
@@ -19954,7 +20112,6 @@
                     </m:rPr>
                     <w:rPr>
                       <w:rFonts w:ascii="Cambria Math" w:eastAsia="MS Gothic" w:hAnsi="Cambria Math"/>
-                      <w:sz w:val="24"/>
                       <w:szCs w:val="24"/>
                       <w:lang w:val="en-US" w:eastAsia="en-US"/>
                     </w:rPr>
@@ -19968,7 +20125,6 @@
                     </m:rPr>
                     <w:rPr>
                       <w:rFonts w:ascii="Cambria Math" w:eastAsia="MS Gothic" w:hAnsi="Cambria Math"/>
-                      <w:sz w:val="24"/>
                       <w:szCs w:val="24"/>
                       <w:lang w:val="en-US" w:eastAsia="en-US"/>
                     </w:rPr>
@@ -19982,7 +20138,6 @@
                 <w:rFonts w:eastAsia="MS Gothic"/>
                 <w:b/>
                 <w:bCs/>
-                <w:sz w:val="24"/>
                 <w:szCs w:val="24"/>
                 <w:lang w:val="en-US" w:eastAsia="en-US"/>
               </w:rPr>
@@ -19991,7 +20146,6 @@
             <w:r>
               <w:rPr>
                 <w:rFonts w:eastAsia="MS Gothic"/>
-                <w:sz w:val="24"/>
                 <w:szCs w:val="24"/>
                 <w:lang w:val="en-US" w:eastAsia="en-US"/>
               </w:rPr>
@@ -20001,7 +20155,6 @@
             <w:r>
               <w:rPr>
                 <w:rFonts w:eastAsia="MS Gothic"/>
-                <w:sz w:val="24"/>
                 <w:szCs w:val="24"/>
                 <w:lang w:val="en-US" w:eastAsia="en-US"/>
               </w:rPr>
@@ -20011,7 +20164,6 @@
             <w:r>
               <w:rPr>
                 <w:rFonts w:eastAsia="MS Gothic"/>
-                <w:sz w:val="24"/>
                 <w:szCs w:val="24"/>
                 <w:lang w:val="en-US" w:eastAsia="en-US"/>
               </w:rPr>
@@ -20021,7 +20173,6 @@
             <w:r>
               <w:rPr>
                 <w:rFonts w:eastAsia="MS Gothic"/>
-                <w:sz w:val="24"/>
                 <w:szCs w:val="24"/>
                 <w:lang w:val="en-US" w:eastAsia="en-US"/>
               </w:rPr>
@@ -20031,7 +20182,6 @@
             <w:r>
               <w:rPr>
                 <w:rFonts w:eastAsia="MS Gothic"/>
-                <w:sz w:val="24"/>
                 <w:szCs w:val="24"/>
                 <w:lang w:val="en-US" w:eastAsia="en-US"/>
               </w:rPr>
@@ -20046,11 +20196,11 @@
           </w:tcPr>
           <w:p>
             <w:pPr>
+              <w:spacing w:line="276" w:lineRule="auto"/>
               <w:ind w:firstLine="0"/>
               <w:jc w:val="left"/>
               <w:rPr>
                 <w:rFonts w:eastAsia="MS Mincho"/>
-                <w:sz w:val="24"/>
                 <w:szCs w:val="24"/>
                 <w:lang w:val="en-US" w:eastAsia="en-US"/>
               </w:rPr>
@@ -20058,7 +20208,6 @@
             <w:r>
               <w:rPr>
                 <w:rFonts w:eastAsia="MS Mincho"/>
-                <w:sz w:val="24"/>
                 <w:szCs w:val="24"/>
                 <w:lang w:val="en-US" w:eastAsia="en-US"/>
               </w:rPr>
@@ -20073,11 +20222,11 @@
           </w:tcPr>
           <w:p>
             <w:pPr>
+              <w:spacing w:line="276" w:lineRule="auto"/>
               <w:ind w:firstLine="0"/>
               <w:jc w:val="left"/>
               <w:rPr>
                 <w:rFonts w:eastAsia="MS Mincho"/>
-                <w:sz w:val="24"/>
                 <w:szCs w:val="24"/>
                 <w:lang w:val="en-US" w:eastAsia="en-US"/>
               </w:rPr>
@@ -20086,7 +20235,6 @@
             <w:r>
               <w:rPr>
                 <w:rFonts w:eastAsia="MS Mincho"/>
-                <w:sz w:val="24"/>
                 <w:szCs w:val="24"/>
                 <w:lang w:val="en-US" w:eastAsia="en-US"/>
               </w:rPr>
@@ -20096,7 +20244,6 @@
             <w:r>
               <w:rPr>
                 <w:rFonts w:eastAsia="MS Mincho"/>
-                <w:sz w:val="24"/>
                 <w:szCs w:val="24"/>
                 <w:lang w:val="en-US" w:eastAsia="en-US"/>
               </w:rPr>
@@ -20106,7 +20253,6 @@
             <w:r>
               <w:rPr>
                 <w:rFonts w:eastAsia="MS Mincho"/>
-                <w:sz w:val="24"/>
                 <w:szCs w:val="24"/>
                 <w:lang w:val="en-US" w:eastAsia="en-US"/>
               </w:rPr>
@@ -20116,7 +20262,6 @@
             <w:r>
               <w:rPr>
                 <w:rFonts w:eastAsia="MS Mincho"/>
-                <w:sz w:val="24"/>
                 <w:szCs w:val="24"/>
                 <w:lang w:val="en-US" w:eastAsia="en-US"/>
               </w:rPr>
@@ -20125,7 +20270,6 @@
             <w:r>
               <w:rPr>
                 <w:rFonts w:eastAsia="MS Mincho"/>
-                <w:sz w:val="24"/>
                 <w:szCs w:val="24"/>
                 <w:lang w:eastAsia="en-US"/>
               </w:rPr>
@@ -20134,7 +20278,6 @@
             <w:r>
               <w:rPr>
                 <w:rFonts w:eastAsia="MS Mincho"/>
-                <w:sz w:val="24"/>
                 <w:szCs w:val="24"/>
                 <w:lang w:val="en-US" w:eastAsia="en-US"/>
               </w:rPr>
@@ -20149,11 +20292,11 @@
           </w:tcPr>
           <w:p>
             <w:pPr>
+              <w:spacing w:line="276" w:lineRule="auto"/>
               <w:ind w:firstLine="0"/>
               <w:jc w:val="left"/>
               <w:rPr>
                 <w:rFonts w:eastAsia="MS Mincho"/>
-                <w:sz w:val="24"/>
                 <w:szCs w:val="24"/>
                 <w:lang w:eastAsia="en-US"/>
               </w:rPr>
@@ -20161,7 +20304,6 @@
             <w:r>
               <w:rPr>
                 <w:rFonts w:eastAsia="MS Mincho"/>
-                <w:sz w:val="24"/>
                 <w:szCs w:val="24"/>
                 <w:lang w:eastAsia="en-US"/>
               </w:rPr>
@@ -20179,12 +20321,12 @@
           </w:tcPr>
           <w:p>
             <w:pPr>
+              <w:spacing w:line="276" w:lineRule="auto"/>
               <w:ind w:firstLine="0"/>
               <w:jc w:val="left"/>
               <w:rPr>
                 <w:b/>
                 <w:bCs/>
-                <w:sz w:val="24"/>
                 <w:szCs w:val="24"/>
               </w:rPr>
             </w:pPr>
@@ -20198,7 +20340,6 @@
                         <w:b/>
                         <w:bCs/>
                         <w:i/>
-                        <w:sz w:val="24"/>
                         <w:szCs w:val="24"/>
                       </w:rPr>
                     </m:ctrlPr>
@@ -20210,7 +20351,6 @@
                       </m:rPr>
                       <w:rPr>
                         <w:rFonts w:ascii="Cambria Math" w:hAnsi="Cambria Math"/>
-                        <w:sz w:val="24"/>
                         <w:szCs w:val="24"/>
                       </w:rPr>
                       <m:t>τ</m:t>
@@ -20223,7 +20363,6 @@
                       </m:rPr>
                       <w:rPr>
                         <w:rFonts w:ascii="Cambria Math" w:hAnsi="Cambria Math"/>
-                        <w:sz w:val="24"/>
                         <w:szCs w:val="24"/>
                       </w:rPr>
                       <m:t>Θ</m:t>
@@ -20242,16 +20381,15 @@
           </w:tcPr>
           <w:p>
             <w:pPr>
+              <w:spacing w:line="276" w:lineRule="auto"/>
               <w:ind w:firstLine="0"/>
               <w:jc w:val="left"/>
               <w:rPr>
-                <w:sz w:val="24"/>
                 <w:szCs w:val="24"/>
               </w:rPr>
             </w:pPr>
             <w:r>
               <w:rPr>
-                <w:sz w:val="24"/>
                 <w:szCs w:val="24"/>
               </w:rPr>
               <w:t>задаётся процедурой калибровки</w:t>
@@ -20266,16 +20404,15 @@
           </w:tcPr>
           <w:p>
             <w:pPr>
+              <w:spacing w:line="276" w:lineRule="auto"/>
               <w:ind w:firstLine="0"/>
               <w:jc w:val="left"/>
               <w:rPr>
-                <w:sz w:val="24"/>
                 <w:szCs w:val="24"/>
               </w:rPr>
             </w:pPr>
             <w:r>
               <w:rPr>
-                <w:sz w:val="24"/>
                 <w:szCs w:val="24"/>
               </w:rPr>
               <w:t>Исторические данные/экспертное согласование</w:t>
@@ -20290,16 +20427,15 @@
           </w:tcPr>
           <w:p>
             <w:pPr>
+              <w:spacing w:line="276" w:lineRule="auto"/>
               <w:ind w:firstLine="0"/>
               <w:jc w:val="left"/>
               <w:rPr>
-                <w:sz w:val="24"/>
                 <w:szCs w:val="24"/>
               </w:rPr>
             </w:pPr>
             <w:r>
               <w:rPr>
-                <w:sz w:val="24"/>
                 <w:szCs w:val="24"/>
               </w:rPr>
               <w:t>Ограничение детализации при доминировании неопределённости на уровне 1</w:t>
@@ -20316,12 +20452,12 @@
           </w:tcPr>
           <w:p>
             <w:pPr>
+              <w:spacing w:line="276" w:lineRule="auto"/>
               <w:ind w:firstLine="0"/>
               <w:jc w:val="left"/>
               <w:rPr>
                 <w:b/>
                 <w:bCs/>
-                <w:sz w:val="24"/>
                 <w:szCs w:val="24"/>
               </w:rPr>
             </w:pPr>
@@ -20335,7 +20471,6 @@
                         <w:b/>
                         <w:bCs/>
                         <w:i/>
-                        <w:sz w:val="24"/>
                         <w:szCs w:val="24"/>
                       </w:rPr>
                     </m:ctrlPr>
@@ -20347,7 +20482,6 @@
                       </m:rPr>
                       <w:rPr>
                         <w:rFonts w:ascii="Cambria Math" w:hAnsi="Cambria Math"/>
-                        <w:sz w:val="24"/>
                         <w:szCs w:val="24"/>
                       </w:rPr>
                       <m:t>K</m:t>
@@ -20360,7 +20494,6 @@
                       </m:rPr>
                       <w:rPr>
                         <w:rFonts w:ascii="Cambria Math" w:hAnsi="Cambria Math"/>
-                        <w:sz w:val="24"/>
                         <w:szCs w:val="24"/>
                       </w:rPr>
                       <m:t>u,crit</m:t>
@@ -20379,16 +20512,15 @@
           </w:tcPr>
           <w:p>
             <w:pPr>
+              <w:spacing w:line="276" w:lineRule="auto"/>
               <w:ind w:firstLine="0"/>
               <w:jc w:val="left"/>
               <w:rPr>
-                <w:sz w:val="24"/>
                 <w:szCs w:val="24"/>
               </w:rPr>
             </w:pPr>
             <w:r>
               <w:rPr>
-                <w:sz w:val="24"/>
                 <w:szCs w:val="24"/>
               </w:rPr>
               <w:t>задаётся процедурой калибровки</w:t>
@@ -20403,16 +20535,15 @@
           </w:tcPr>
           <w:p>
             <w:pPr>
+              <w:spacing w:line="276" w:lineRule="auto"/>
               <w:ind w:firstLine="0"/>
               <w:jc w:val="left"/>
               <w:rPr>
-                <w:sz w:val="24"/>
                 <w:szCs w:val="24"/>
               </w:rPr>
             </w:pPr>
             <w:r>
               <w:rPr>
-                <w:sz w:val="24"/>
                 <w:szCs w:val="24"/>
               </w:rPr>
               <w:t>Локальная калибровка на навыках</w:t>
@@ -20427,16 +20558,15 @@
           </w:tcPr>
           <w:p>
             <w:pPr>
+              <w:spacing w:line="276" w:lineRule="auto"/>
               <w:ind w:firstLine="0"/>
               <w:jc w:val="left"/>
               <w:rPr>
-                <w:sz w:val="24"/>
                 <w:szCs w:val="24"/>
               </w:rPr>
             </w:pPr>
             <w:r>
               <w:rPr>
-                <w:sz w:val="24"/>
                 <w:szCs w:val="24"/>
               </w:rPr>
               <w:t>Контроль противоречивости локальных свидетельств по навыку</w:t>
@@ -20446,6 +20576,9 @@
       </w:tr>
     </w:tbl>
     <w:p>
+      <w:pPr>
+        <w:spacing w:line="276" w:lineRule="auto"/>
+      </w:pPr>
       <w:r>
         <w:t xml:space="preserve">Для проверки устойчивости параметров была выполнена серия вычислительных экспериментов с варьированием коэффициентов в диапазоне ±20% от базовых значений. При отклонении </w:t>
       </w:r>
@@ -20544,6 +20677,9 @@
       </w:r>
     </w:p>
     <w:p>
+      <w:pPr>
+        <w:spacing w:line="276" w:lineRule="auto"/>
+      </w:pPr>
       <w:r>
         <w:t>П</w:t>
       </w:r>
@@ -20554,6 +20690,7 @@
     <w:p>
       <w:pPr>
         <w:pStyle w:val="2"/>
+        <w:spacing w:line="276" w:lineRule="auto"/>
         <w:rPr>
           <w:lang w:val="ru-RU"/>
         </w:rPr>
@@ -20573,12 +20710,20 @@
       </w:r>
     </w:p>
     <w:p>
-      <w:r>
-        <w:t>Экспериментальная апробация разработанной системы была проведена на образовательных программах направления «Информатика и вычислительная техника» (09.03.01) РТУ МИРЭА. Анализу подверглись рабочие программы 10 дисциплин профессионального цикла различных профилей подготовки, связанных с программированием: «Технологии программирования», «Базы данных», «Веб-программирование», «Алгоритмы и структуры данных», «Операционные системы», «Разработка мобильных приложений», «Облачные технологии», «Машинное обучение», «Программная инженерия», «Архитектура программных систем». Общий объём академических часов проанализированных дисциплин составил 864 часа, что соответствует примерно 36% от профессионального цикла программы.</w:t>
+      <w:pPr>
+        <w:spacing w:line="276" w:lineRule="auto"/>
+      </w:pPr>
+      <w:r>
+        <w:t xml:space="preserve">Экспериментальная апробация разработанной системы была проведена на образовательных программах направления «Информатика и вычислительная техника» (09.03.01) РТУ МИРЭА. Анализу подверглись рабочие программы 10 дисциплин профессионального цикла различных профилей подготовки, связанных с программированием: «Технологии программирования», «Базы данных», «Веб-программирование», «Алгоритмы и структуры данных», «Операционные системы», «Разработка мобильных приложений», «Облачные технологии», «Машинное обучение», </w:t>
+      </w:r>
+      <w:r>
+        <w:lastRenderedPageBreak/>
+        <w:t>«Программная инженерия», «Архитектура программных систем». Общий объём академических часов проанализированных дисциплин составил 864 часа, что соответствует примерно 36% от профессионального цикла программы.</w:t>
       </w:r>
     </w:p>
     <w:p>
       <w:pPr>
+        <w:spacing w:line="276" w:lineRule="auto"/>
         <w:rPr>
           <w:i/>
           <w:iCs/>
@@ -20608,12 +20753,17 @@
       </w:r>
     </w:p>
     <w:p>
-      <w:pPr/>
+      <w:pPr>
+        <w:spacing w:line="276" w:lineRule="auto"/>
+      </w:pPr>
       <w:r>
         <w:t>По результатам интеграции свидетельств в рамках ТДШ и последующего расчёта показателя дефицита Δ_i выявлено превышение порога τΔ = 0.15 в четырёх из 25 кластеров компетенций (16% проанализированных кластеров). Наибольшие значения дефицита получены для кластеров «Java» (Δ = +0.87), «CI/CD» (Δ = +0.75), «Python» (Δ = +0.42) и «Реляционные базы данных» (Δ = +0.25). Эти кластеры характеризуются высокой динамикой развития технологий и растущим спросом на рынке труда, при этом текущее покрытие в учебных планах остаётся недостаточным.</w:t>
       </w:r>
     </w:p>
     <w:p>
+      <w:pPr>
+        <w:spacing w:line="276" w:lineRule="auto"/>
+      </w:pPr>
       <w:r>
         <w:t xml:space="preserve">Для оценки согласованности разнородных источников использован показатель конфликтности </w:t>
       </w:r>
@@ -20769,6 +20919,9 @@
       </w:r>
     </w:p>
     <w:p>
+      <w:pPr>
+        <w:spacing w:line="276" w:lineRule="auto"/>
+      </w:pPr>
       <w:r>
         <w:t xml:space="preserve">Сводные результаты по кластерам компетенций с наибольшими дефицитами представлены в табл. </w:t>
       </w:r>
@@ -20781,6 +20934,7 @@
     </w:p>
     <w:p>
       <w:pPr>
+        <w:spacing w:line="276" w:lineRule="auto"/>
         <w:ind w:firstLine="0"/>
         <w:rPr>
           <w:i/>
@@ -20816,11 +20970,11 @@
         <w:tblLook w:val="04A0" w:firstRow="1" w:lastRow="0" w:firstColumn="1" w:lastColumn="0" w:noHBand="0" w:noVBand="1"/>
       </w:tblPr>
       <w:tblGrid>
-        <w:gridCol w:w="1696"/>
-        <w:gridCol w:w="993"/>
-        <w:gridCol w:w="1134"/>
-        <w:gridCol w:w="850"/>
-        <w:gridCol w:w="4671"/>
+        <w:gridCol w:w="1677"/>
+        <w:gridCol w:w="1345"/>
+        <w:gridCol w:w="1345"/>
+        <w:gridCol w:w="1481"/>
+        <w:gridCol w:w="3496"/>
       </w:tblGrid>
       <w:tr>
         <w:tc>
@@ -20830,12 +20984,12 @@
           </w:tcPr>
           <w:p>
             <w:pPr>
+              <w:spacing w:line="276" w:lineRule="auto"/>
               <w:ind w:firstLine="0"/>
               <w:jc w:val="center"/>
               <w:rPr>
                 <w:b/>
                 <w:bCs/>
-                <w:sz w:val="24"/>
                 <w:szCs w:val="24"/>
               </w:rPr>
             </w:pPr>
@@ -20843,7 +20997,6 @@
               <w:rPr>
                 <w:b/>
                 <w:bCs/>
-                <w:sz w:val="24"/>
                 <w:szCs w:val="24"/>
               </w:rPr>
               <w:t>Кластер компетенций</w:t>
@@ -20857,12 +21010,12 @@
           </w:tcPr>
           <w:p>
             <w:pPr>
+              <w:spacing w:line="276" w:lineRule="auto"/>
               <w:ind w:firstLine="0"/>
               <w:jc w:val="center"/>
               <w:rPr>
                 <w:b/>
                 <w:bCs/>
-                <w:sz w:val="24"/>
                 <w:szCs w:val="24"/>
               </w:rPr>
             </w:pPr>
@@ -20871,7 +21024,6 @@
               <w:rPr>
                 <w:b/>
                 <w:bCs/>
-                <w:sz w:val="24"/>
                 <w:szCs w:val="24"/>
               </w:rPr>
               <w:t>BetP</w:t>
@@ -20886,12 +21038,12 @@
           </w:tcPr>
           <w:p>
             <w:pPr>
+              <w:spacing w:line="276" w:lineRule="auto"/>
               <w:ind w:firstLine="0"/>
               <w:jc w:val="center"/>
               <w:rPr>
                 <w:b/>
                 <w:bCs/>
-                <w:sz w:val="24"/>
                 <w:szCs w:val="24"/>
               </w:rPr>
             </w:pPr>
@@ -20900,7 +21052,6 @@
               <w:rPr>
                 <w:b/>
                 <w:bCs/>
-                <w:sz w:val="24"/>
                 <w:szCs w:val="24"/>
               </w:rPr>
               <w:t>supply_i</w:t>
@@ -20915,12 +21066,12 @@
           </w:tcPr>
           <w:p>
             <w:pPr>
+              <w:spacing w:line="276" w:lineRule="auto"/>
               <w:ind w:firstLine="0"/>
               <w:jc w:val="center"/>
               <w:rPr>
                 <w:b/>
                 <w:bCs/>
-                <w:sz w:val="24"/>
                 <w:szCs w:val="24"/>
               </w:rPr>
             </w:pPr>
@@ -20929,7 +21080,6 @@
               <w:rPr>
                 <w:b/>
                 <w:bCs/>
-                <w:sz w:val="24"/>
                 <w:szCs w:val="24"/>
               </w:rPr>
               <w:t>Δ_i</w:t>
@@ -20944,12 +21094,12 @@
           </w:tcPr>
           <w:p>
             <w:pPr>
+              <w:spacing w:line="276" w:lineRule="auto"/>
               <w:ind w:firstLine="0"/>
               <w:jc w:val="center"/>
               <w:rPr>
                 <w:b/>
                 <w:bCs/>
-                <w:sz w:val="24"/>
                 <w:szCs w:val="24"/>
               </w:rPr>
             </w:pPr>
@@ -20957,7 +21107,6 @@
               <w:rPr>
                 <w:b/>
                 <w:bCs/>
-                <w:sz w:val="24"/>
                 <w:szCs w:val="24"/>
               </w:rPr>
               <w:t>Рекомендация</w:t>
@@ -20973,17 +21122,16 @@
           </w:tcPr>
           <w:p>
             <w:pPr>
+              <w:spacing w:line="276" w:lineRule="auto"/>
               <w:ind w:firstLine="0"/>
               <w:jc w:val="left"/>
               <w:rPr>
-                <w:sz w:val="24"/>
                 <w:szCs w:val="24"/>
                 <w:lang w:val="en-US"/>
               </w:rPr>
             </w:pPr>
             <w:r>
               <w:rPr>
-                <w:sz w:val="24"/>
                 <w:szCs w:val="24"/>
                 <w:lang w:val="en-US"/>
               </w:rPr>
@@ -20997,6 +21145,9 @@
             <w:vAlign w:val="center"/>
           </w:tcPr>
           <w:p>
+            <w:pPr>
+              <w:spacing w:line="276" w:lineRule="auto"/>
+            </w:pPr>
             <w:r>
               <w:t>0.90</w:t>
             </w:r>
@@ -21008,6 +21159,9 @@
             <w:vAlign w:val="center"/>
           </w:tcPr>
           <w:p>
+            <w:pPr>
+              <w:spacing w:line="276" w:lineRule="auto"/>
+            </w:pPr>
             <w:r>
               <w:t>0.02</w:t>
             </w:r>
@@ -21019,6 +21173,9 @@
             <w:vAlign w:val="center"/>
           </w:tcPr>
           <w:p>
+            <w:pPr>
+              <w:spacing w:line="276" w:lineRule="auto"/>
+            </w:pPr>
             <w:r>
               <w:t>+0.87</w:t>
             </w:r>
@@ -21030,8 +21187,47 @@
             <w:vAlign w:val="center"/>
           </w:tcPr>
           <w:p>
+            <w:pPr>
+              <w:spacing w:line="276" w:lineRule="auto"/>
+              <w:rPr>
+                <w:lang w:val="en-US"/>
+              </w:rPr>
+            </w:pPr>
             <w:r>
-              <w:t>Усилить: ввести модули по Java SE/EE, Spring Boot, Hibernate</w:t>
+              <w:t>Усилить</w:t>
+            </w:r>
+            <w:r>
+              <w:rPr>
+                <w:lang w:val="en-US"/>
+              </w:rPr>
+              <w:t xml:space="preserve">: </w:t>
+            </w:r>
+            <w:r>
+              <w:t>ввести</w:t>
+            </w:r>
+            <w:r>
+              <w:rPr>
+                <w:lang w:val="en-US"/>
+              </w:rPr>
+              <w:t xml:space="preserve"> </w:t>
+            </w:r>
+            <w:r>
+              <w:t>модули</w:t>
+            </w:r>
+            <w:r>
+              <w:rPr>
+                <w:lang w:val="en-US"/>
+              </w:rPr>
+              <w:t xml:space="preserve"> </w:t>
+            </w:r>
+            <w:r>
+              <w:t>по</w:t>
+            </w:r>
+            <w:r>
+              <w:rPr>
+                <w:lang w:val="en-US"/>
+              </w:rPr>
+              <w:t xml:space="preserve"> Java SE/EE, Spring Boot, Hibernate</w:t>
             </w:r>
           </w:p>
         </w:tc>
@@ -21044,16 +21240,15 @@
           </w:tcPr>
           <w:p>
             <w:pPr>
+              <w:spacing w:line="276" w:lineRule="auto"/>
               <w:ind w:firstLine="0"/>
               <w:jc w:val="left"/>
               <w:rPr>
-                <w:sz w:val="24"/>
                 <w:szCs w:val="24"/>
               </w:rPr>
             </w:pPr>
             <w:r>
               <w:rPr>
-                <w:sz w:val="24"/>
                 <w:szCs w:val="24"/>
               </w:rPr>
               <w:t>CI/CD</w:t>
@@ -21066,6 +21261,9 @@
             <w:vAlign w:val="center"/>
           </w:tcPr>
           <w:p>
+            <w:pPr>
+              <w:spacing w:line="276" w:lineRule="auto"/>
+            </w:pPr>
             <w:r>
               <w:t>0.78</w:t>
             </w:r>
@@ -21077,6 +21275,9 @@
             <w:vAlign w:val="center"/>
           </w:tcPr>
           <w:p>
+            <w:pPr>
+              <w:spacing w:line="276" w:lineRule="auto"/>
+            </w:pPr>
             <w:r>
               <w:t>0.04</w:t>
             </w:r>
@@ -21088,6 +21289,9 @@
             <w:vAlign w:val="center"/>
           </w:tcPr>
           <w:p>
+            <w:pPr>
+              <w:spacing w:line="276" w:lineRule="auto"/>
+            </w:pPr>
             <w:r>
               <w:t>+0.75</w:t>
             </w:r>
@@ -21099,6 +21303,9 @@
             <w:vAlign w:val="center"/>
           </w:tcPr>
           <w:p>
+            <w:pPr>
+              <w:spacing w:line="276" w:lineRule="auto"/>
+            </w:pPr>
             <w:r>
               <w:t>Усилить: ввести практики Docker, Jenkins, GitLab CI/CD</w:t>
             </w:r>
@@ -21113,17 +21320,16 @@
           </w:tcPr>
           <w:p>
             <w:pPr>
+              <w:spacing w:line="276" w:lineRule="auto"/>
               <w:ind w:firstLine="0"/>
               <w:jc w:val="left"/>
               <w:rPr>
-                <w:sz w:val="24"/>
                 <w:szCs w:val="24"/>
                 <w:lang w:val="en-US"/>
               </w:rPr>
             </w:pPr>
             <w:r>
               <w:rPr>
-                <w:sz w:val="24"/>
                 <w:szCs w:val="24"/>
                 <w:lang w:val="en-US"/>
               </w:rPr>
@@ -21137,6 +21343,9 @@
             <w:vAlign w:val="center"/>
           </w:tcPr>
           <w:p>
+            <w:pPr>
+              <w:spacing w:line="276" w:lineRule="auto"/>
+            </w:pPr>
             <w:r>
               <w:t>0.46</w:t>
             </w:r>
@@ -21148,6 +21357,9 @@
             <w:vAlign w:val="center"/>
           </w:tcPr>
           <w:p>
+            <w:pPr>
+              <w:spacing w:line="276" w:lineRule="auto"/>
+            </w:pPr>
             <w:r>
               <w:t>0.04</w:t>
             </w:r>
@@ -21159,6 +21371,9 @@
             <w:vAlign w:val="center"/>
           </w:tcPr>
           <w:p>
+            <w:pPr>
+              <w:spacing w:line="276" w:lineRule="auto"/>
+            </w:pPr>
             <w:r>
               <w:t>+0.42</w:t>
             </w:r>
@@ -21170,6 +21385,9 @@
             <w:vAlign w:val="center"/>
           </w:tcPr>
           <w:p>
+            <w:pPr>
+              <w:spacing w:line="276" w:lineRule="auto"/>
+            </w:pPr>
             <w:r>
               <w:t>Вариативность: ввести элективный курс по Python (data processing, автоматизация)</w:t>
             </w:r>
@@ -21184,37 +21402,19 @@
           </w:tcPr>
           <w:p>
             <w:pPr>
+              <w:spacing w:line="276" w:lineRule="auto"/>
               <w:ind w:firstLine="0"/>
               <w:jc w:val="left"/>
               <w:rPr>
-                <w:sz w:val="24"/>
                 <w:szCs w:val="24"/>
               </w:rPr>
             </w:pPr>
-            <w:proofErr w:type="spellStart"/>
             <w:r>
               <w:rPr>
-                <w:sz w:val="24"/>
                 <w:szCs w:val="24"/>
               </w:rPr>
-              <w:t>Реляционные базы данных</w:t>
+              <w:t xml:space="preserve">Реляционные базы данных </w:t>
             </w:r>
-            <w:proofErr w:type="spellEnd"/>
-            <w:r>
-              <w:rPr>
-                <w:sz w:val="24"/>
-                <w:szCs w:val="24"/>
-              </w:rPr>
-              <w:t xml:space="preserve"> </w:t>
-            </w:r>
-            <w:proofErr w:type="spellStart"/>
-            <w:r>
-              <w:rPr>
-                <w:sz w:val="24"/>
-                <w:szCs w:val="24"/>
-              </w:rPr>
-            </w:r>
-            <w:proofErr w:type="spellEnd"/>
           </w:p>
         </w:tc>
         <w:tc>
@@ -21223,6 +21423,9 @@
             <w:vAlign w:val="center"/>
           </w:tcPr>
           <w:p>
+            <w:pPr>
+              <w:spacing w:line="276" w:lineRule="auto"/>
+            </w:pPr>
             <w:r>
               <w:t>0.29</w:t>
             </w:r>
@@ -21234,6 +21437,9 @@
             <w:vAlign w:val="center"/>
           </w:tcPr>
           <w:p>
+            <w:pPr>
+              <w:spacing w:line="276" w:lineRule="auto"/>
+            </w:pPr>
             <w:r>
               <w:t>0.04</w:t>
             </w:r>
@@ -21245,6 +21451,9 @@
             <w:vAlign w:val="center"/>
           </w:tcPr>
           <w:p>
+            <w:pPr>
+              <w:spacing w:line="276" w:lineRule="auto"/>
+            </w:pPr>
             <w:r>
               <w:t>+0.25</w:t>
             </w:r>
@@ -21256,6 +21465,9 @@
             <w:vAlign w:val="center"/>
           </w:tcPr>
           <w:p>
+            <w:pPr>
+              <w:spacing w:line="276" w:lineRule="auto"/>
+            </w:pPr>
             <w:r>
               <w:t>Вариативность: расширить раздел SQL/PostgreSQL в дисциплинах баз данных</w:t>
             </w:r>
@@ -21263,9 +21475,14 @@
         </w:tc>
       </w:tr>
     </w:tbl>
-    <w:p/>
     <w:p>
       <w:pPr>
+        <w:spacing w:line="276" w:lineRule="auto"/>
+      </w:pPr>
+    </w:p>
+    <w:p>
+      <w:pPr>
+        <w:spacing w:line="276" w:lineRule="auto"/>
         <w:rPr>
           <w:i/>
           <w:iCs/>
@@ -21294,6 +21511,9 @@
       </w:r>
     </w:p>
     <w:p>
+      <w:pPr>
+        <w:spacing w:line="276" w:lineRule="auto"/>
+      </w:pPr>
       <w:r>
         <w:t>У</w:t>
       </w:r>
@@ -21416,7 +21636,11 @@
         </m:sSup>
       </m:oMath>
       <w:r>
-        <w:t>. Для уровня</w:t>
+        <w:t xml:space="preserve">. </w:t>
+      </w:r>
+      <w:r>
+        <w:lastRenderedPageBreak/>
+        <w:t>Для уровня</w:t>
       </w:r>
       <w:r>
         <w:t xml:space="preserve"> навыков</w:t>
@@ -21572,6 +21796,9 @@
       </w:r>
     </w:p>
     <w:p>
+      <w:pPr>
+        <w:spacing w:line="276" w:lineRule="auto"/>
+      </w:pPr>
       <w:r>
         <w:t xml:space="preserve">В качестве иллюстрации работы уровня 2 рассмотрены два элемента содержания дисциплины «Технологии программирования»: язык программирования C++ (случай высокой уверенности решения) и фреймворк </w:t>
       </w:r>
@@ -21581,14 +21808,13 @@
       </w:r>
       <w:proofErr w:type="spellEnd"/>
       <w:r>
-        <w:t xml:space="preserve"> (случай высокой неопределённости). Результаты поэтапного </w:t>
-      </w:r>
-      <w:r>
-        <w:lastRenderedPageBreak/>
-        <w:t>комбинирования свидетельств по навыкам представлены на рис. 3 и рис. 4 соответственно.</w:t>
+        <w:t xml:space="preserve"> (случай высокой неопределённости). Результаты поэтапного комбинирования свидетельств по навыкам представлены на рис. 3 и рис. 4 соответственно.</w:t>
       </w:r>
     </w:p>
     <w:p>
+      <w:pPr>
+        <w:spacing w:line="276" w:lineRule="auto"/>
+      </w:pPr>
       <w:r>
         <w:t xml:space="preserve">Для навыка C++ (рис. 3) базовые распределения масс источников демонстрируют преобладание поддержки включения со стороны экспертного и прогнозного источников при высокой неопределённости со стороны рынка труда. Последовательное комбинирование свидетельств приводит к итоговому распределению </w:t>
       </w:r>
@@ -22044,6 +22270,7 @@
           </w:tcPr>
           <w:p>
             <w:pPr>
+              <w:spacing w:line="276" w:lineRule="auto"/>
               <w:ind w:firstLine="0"/>
             </w:pPr>
             <w:r>
@@ -22051,7 +22278,6 @@
                 <w:rFonts w:eastAsia="Aptos"/>
                 <w:noProof/>
                 <w:kern w:val="2"/>
-                <w:sz w:val="24"/>
                 <w:szCs w:val="24"/>
                 <w14:ligatures w14:val="standardContextual"/>
               </w:rPr>
@@ -22099,6 +22325,7 @@
           </w:tcPr>
           <w:p>
             <w:pPr>
+              <w:spacing w:line="276" w:lineRule="auto"/>
               <w:ind w:firstLine="0"/>
             </w:pPr>
             <w:r>
@@ -22106,7 +22333,6 @@
                 <w:rFonts w:eastAsia="Aptos"/>
                 <w:noProof/>
                 <w:kern w:val="2"/>
-                <w:sz w:val="24"/>
                 <w:szCs w:val="24"/>
                 <w14:ligatures w14:val="standardContextual"/>
               </w:rPr>
@@ -22156,6 +22382,7 @@
           </w:tcPr>
           <w:p>
             <w:pPr>
+              <w:spacing w:line="276" w:lineRule="auto"/>
               <w:ind w:firstLine="0"/>
             </w:pPr>
             <w:r>
@@ -22211,6 +22438,7 @@
           </w:tcPr>
           <w:p>
             <w:pPr>
+              <w:spacing w:line="276" w:lineRule="auto"/>
               <w:ind w:firstLine="0"/>
             </w:pPr>
             <w:r>
@@ -22272,7 +22500,7 @@
     </w:tbl>
     <w:p>
       <w:pPr>
-        <w:spacing w:before="120"/>
+        <w:spacing w:before="120" w:line="276" w:lineRule="auto"/>
       </w:pPr>
       <w:r>
         <w:t xml:space="preserve">Для навыка работы с фреймворком </w:t>
@@ -22459,30 +22687,34 @@
           <w:rPr>
             <w:rFonts w:ascii="Cambria Math" w:hAnsi="Cambria Math"/>
           </w:rPr>
+          <w:lastRenderedPageBreak/>
           <m:t>0,0011</m:t>
         </m:r>
       </m:oMath>
       <w:r>
-        <w:t xml:space="preserve"> формируется вывод о крайне низкой поддержке включения данного навыка для целевой категории вакансий, а высокая масса неопределённости свидетельствует о недостаточности или слабой информативности исходных данных для </w:t>
-      </w:r>
-      <w:r>
-        <w:lastRenderedPageBreak/>
-        <w:t>однозначного решения. В этой ситуации система предлагает перевод навыка в вариативную часть программы и/или проведение дополнительной экспертизы для уточнения целесообразности его включения.</w:t>
+        <w:t xml:space="preserve"> формируется вывод о крайне низкой поддержке включения данного навыка для целевой категории вакансий, а высокая масса неопределённости свидетельствует о недостаточности или слабой информативности исходных данных для однозначного решения. В этой ситуации система предлагает перевод навыка в вариативную часть программы и/или проведение дополнительной экспертизы для уточнения целесообразности его включения.</w:t>
       </w:r>
     </w:p>
     <w:p>
-      <w:pPr/>
+      <w:pPr>
+        <w:spacing w:line="276" w:lineRule="auto"/>
+      </w:pPr>
       <w:r>
         <w:t>Анализ результатов уровня 1 подтверждает, что выявленные дефициты покрытия согласуются с актуальными тенденциями развития ИТ-отрасли. Кластеры Java (Δ = +0.87, m*(U) = 0.11) и CI/CD (Δ = +0.75, m*(U) = 0.13) демонстрируют высокий дефицит при низкой неопределённости — система однозначно рекомендует их усилить, поскольку Java практически отсутствует в анализируемом учебном плане (S = 0.02), тогда как данный кластер фигурирует более чем в каждой четвёртой вакансии по направлению [26]. Кластеры Python (Δ = +0.42, m*(U) = 0.27) и Реляционные базы данных (Δ = +0.25, m*(U) = 0.31) характеризуются умеренным дефицитом при значимой неопределённости и получили рекомендацию «вариативность» — дополнительная экспертная верификация необходима, т.к. насыщение рынка или высокая конкуренция среди кандидатов могут сдерживать рост реального дефицита по этим кластерам. При этом кластер Golang (BetP = 0.43, m*(U) = 0.56) демонстрирует слабый рыночный сигнал при доминирующей неопределённости — жёсткое расширение программы при столь высоком m*(U) нецелесообразно. Кластер 1С показывает отрицательный дефицит (Δ = −0.02): учебный план уже перекрывает рыночный запрос, что определяет рекомендацию «стабилизировать».</w:t>
       </w:r>
     </w:p>
     <w:p>
-      <w:pPr/>
+      <w:pPr>
+        <w:spacing w:line="276" w:lineRule="auto"/>
+      </w:pPr>
       <w:r>
         <w:t>Для валидации результатов была проведена экспертная оценка рекомендаций системы. Трём экспертам (руководитель образовательной программы, представитель работодателя, ведущий преподаватель профильных дисциплин) были представлены рекомендации по шести кластерам компетенций с наибольшими отклонениями Δ (как положительными, так и отрицательными). Эксперты независимо оценивали каждую рекомендацию по шкале: «полностью согласен» (2 балла), «частично согласен» (1 балл), «не согласен» (0 баллов). Средний балл согласия экспертов с рекомендациями системы составил 1.73 из 2.0 (86.5% согласия), что свидетельствует о высокой валидности предложенного подхода. Наибольшее согласие (100%) наблюдалось для кластеров Java и CI/CD, наименьшее (67%) — для кластеров Python и Реляционных баз данных, где умеренный дефицит при значимой неопределённости (m*(U) ≈ 0.27–0.31) допускал альтернативные интерпретации.</w:t>
       </w:r>
     </w:p>
     <w:p>
+      <w:pPr>
+        <w:spacing w:line="276" w:lineRule="auto"/>
+      </w:pPr>
       <w:r>
         <w:t xml:space="preserve">Таким образом, результаты экспериментальной апробации подтверждают, что разработанная система формирует обоснованные рекомендации по актуализации образовательных программ на основе интеграции разнородных источников данных </w:t>
       </w:r>
@@ -22518,30 +22750,44 @@
     <w:p>
       <w:pPr>
         <w:pStyle w:val="1"/>
+        <w:spacing w:line="276" w:lineRule="auto"/>
       </w:pPr>
       <w:r>
         <w:t>Выводы</w:t>
       </w:r>
     </w:p>
     <w:p>
-      <w:pPr/>
-      <w:r>
-        <w:t>Предложен двухуровневый контур поддержки решений для проактивного обновления образовательных программ, в котором уровень 1 обеспечивает формализованное выявление приоритетных кластеров компетенций в общей рамке различения Θ на основе интеграции разнородных свидетельств, а уровень 2 реализует практическое управленческое воздействие через локальную DST-агрегацию по навыкам внутри выбранных кластеров на рамке Θ_C. Такая декомпозиция снимает методологическое смешение объектов решения и обеспечивает согласованность между «стратегическим» выбором направления обновления и «тактической» детализацией до конкретных изменений РПД/УП.</w:t>
+      <w:pPr>
+        <w:spacing w:line="276" w:lineRule="auto"/>
+      </w:pPr>
+      <w:r>
+        <w:t xml:space="preserve">Предложен двухуровневый контур поддержки решений для проактивного обновления образовательных программ, в котором уровень 1 обеспечивает формализованное выявление приоритетных кластеров компетенций в общей рамке </w:t>
+      </w:r>
+      <w:r>
+        <w:lastRenderedPageBreak/>
+        <w:t>различения Θ на основе интеграции разнородных свидетельств, а уровень 2 реализует практическое управленческое воздействие через локальную DST-агрегацию по навыкам внутри выбранных кластеров на рамке Θ_C. Такая декомпозиция снимает методологическое смешение объектов решения и обеспечивает согласованность между «стратегическим» выбором направления обновления и «тактической» детализацией до конкретных изменений РПД/УП.</w:t>
       </w:r>
     </w:p>
     <w:p>
-      <w:pPr/>
+      <w:pPr>
+        <w:spacing w:line="276" w:lineRule="auto"/>
+      </w:pPr>
       <w:r>
         <w:t>Научная новизна подхода состоит в том, что механизм интеграции разнородной информации реализован не как простая свёртка показателей, а как регламентируемая DST-процедура с построением BPA по каждому источнику, дисконтированием по надёжности и явным контролем конфликтности K с переключением на альтернативные правила комбинирования при высоком конфликте. Это обеспечивает корректную работу в условиях неполноты и противоречивости источников, принципиально характерных для системы «рынок труда — эксперты — прогнозы — нормативные документы».</w:t>
       </w:r>
     </w:p>
     <w:p>
-      <w:pPr/>
+      <w:pPr>
+        <w:spacing w:line="276" w:lineRule="auto"/>
+      </w:pPr>
       <w:r>
         <w:t>Практическая значимость работы состоит в создании веб-ориентированной СППР, реализующей полный цикл: извлечение и нормализацию навыков из вакансий, сопоставление их с кластерами, DST-агрегацию на уровне кластеров, выделение множества кластеров компетенций, подлежащих обязательной управленческой детализации и действиям (усилить / стабилизировать / вариативность), а также формирование рекомендаций по обновлению РПД/УП с сохранением истории расчётов и решений в СУБД. Предложенная методика доведена до инструментального решения, пригодного для практического применения методистами и руководителями образовательных программ.</w:t>
       </w:r>
     </w:p>
     <w:p>
+      <w:pPr>
+        <w:spacing w:line="276" w:lineRule="auto"/>
+      </w:pPr>
       <w:r>
         <w:t xml:space="preserve">Экспериментальная апробация на образовательных программах направления 09.03.01 показала, что на уровне 1 система выявляет структурно интерпретируемые дефициты покрытия по кластерам, согласующиеся с динамикой ИТ-рынка, а на уровне 2 демонстрирует различение случаев высокой определённости и высокой неопределённости по конкретным навыкам (показательные примеры C++ и </w:t>
       </w:r>
@@ -22555,17 +22801,25 @@
       </w:r>
     </w:p>
     <w:p>
-      <w:pPr/>
+      <w:pPr>
+        <w:spacing w:line="276" w:lineRule="auto"/>
+      </w:pPr>
       <w:r>
         <w:t>Подтверждением прикладной состоятельности является экспертная валидация рекомендаций (уровень согласия 86,5%), а также эмпирически обоснованная настройка порогов (дефицит τΔ = 0.15, конфликт τK = 0.4) и анализ чувствительности, демонстрирующие работоспособность методики в управленческом контуре при реалистичных вариациях параметров.</w:t>
       </w:r>
     </w:p>
     <w:p>
+      <w:pPr>
+        <w:spacing w:line="276" w:lineRule="auto"/>
+      </w:pPr>
       <w:r>
         <w:br w:type="page"/>
       </w:r>
     </w:p>
     <w:p>
+      <w:pPr>
+        <w:spacing w:line="276" w:lineRule="auto"/>
+      </w:pPr>
       <w:r>
         <w:lastRenderedPageBreak/>
         <w:t>Литература</w:t>
@@ -22582,7 +22836,7 @@
 </file>
 
 <file path=word/endnotes.xml><?xml version="1.0" encoding="utf-8"?>
-<w:endnotes xmlns:wpc="http://schemas.microsoft.com/office/word/2010/wordprocessingCanvas" xmlns:cx="http://schemas.microsoft.com/office/drawing/2014/chartex" xmlns:cx1="http://schemas.microsoft.com/office/drawing/2015/9/8/chartex" xmlns:cx2="http://schemas.microsoft.com/office/drawing/2015/10/21/chartex" xmlns:cx3="http://schemas.microsoft.com/office/drawing/2016/5/9/chartex" xmlns:cx4="http://schemas.microsoft.com/office/drawing/2016/5/10/chartex" xmlns:cx5="http://schemas.microsoft.com/office/drawing/2016/5/11/chartex" xmlns:cx6="http://schemas.microsoft.com/office/drawing/2016/5/12/chartex" xmlns:cx7="http://schemas.microsoft.com/office/drawing/2016/5/13/chartex" xmlns:cx8="http://schemas.microsoft.com/office/drawing/2016/5/14/chartex" xmlns:mc="http://schemas.openxmlformats.org/markup-compatibility/2006" xmlns:aink="http://schemas.microsoft.com/office/drawing/2016/ink" xmlns:am3d="http://schemas.microsoft.com/office/drawing/2017/model3d" xmlns:o="urn:schemas-microsoft-com:office:office" xmlns:r="http://schemas.openxmlformats.org/officeDocument/2006/relationships" xmlns:m="http://schemas.openxmlformats.org/officeDocument/2006/math" xmlns:v="urn:schemas-microsoft-com:vml" xmlns:wp14="http://schemas.microsoft.com/office/word/2010/wordprocessingDrawing" xmlns:wp="http://schemas.openxmlformats.org/drawingml/2006/wordprocessingDrawing" xmlns:w10="urn:schemas-microsoft-com:office:word" xmlns:w="http://schemas.openxmlformats.org/wordprocessingml/2006/main" xmlns:w14="http://schemas.microsoft.com/office/word/2010/wordml" xmlns:w15="http://schemas.microsoft.com/office/word/2012/wordml" xmlns:w16cex="http://schemas.microsoft.com/office/word/2018/wordml/cex" xmlns:w16cid="http://schemas.microsoft.com/office/word/2016/wordml/cid" xmlns:w16="http://schemas.microsoft.com/office/word/2018/wordml" xmlns:w16se="http://schemas.microsoft.com/office/word/2015/wordml/symex" xmlns:wpg="http://schemas.microsoft.com/office/word/2010/wordprocessingGroup" xmlns:wpi="http://schemas.microsoft.com/office/word/2010/wordprocessingInk" xmlns:wne="http://schemas.microsoft.com/office/word/2006/wordml" xmlns:wps="http://schemas.microsoft.com/office/word/2010/wordprocessingShape" mc:Ignorable="w14 w15 w16se w16cid w16 w16cex wp14">
+<w:endnotes xmlns:wpc="http://schemas.microsoft.com/office/word/2010/wordprocessingCanvas" xmlns:cx="http://schemas.microsoft.com/office/drawing/2014/chartex" xmlns:cx1="http://schemas.microsoft.com/office/drawing/2015/9/8/chartex" xmlns:cx2="http://schemas.microsoft.com/office/drawing/2015/10/21/chartex" xmlns:cx3="http://schemas.microsoft.com/office/drawing/2016/5/9/chartex" xmlns:cx4="http://schemas.microsoft.com/office/drawing/2016/5/10/chartex" xmlns:cx5="http://schemas.microsoft.com/office/drawing/2016/5/11/chartex" xmlns:cx6="http://schemas.microsoft.com/office/drawing/2016/5/12/chartex" xmlns:cx7="http://schemas.microsoft.com/office/drawing/2016/5/13/chartex" xmlns:cx8="http://schemas.microsoft.com/office/drawing/2016/5/14/chartex" xmlns:mc="http://schemas.openxmlformats.org/markup-compatibility/2006" xmlns:aink="http://schemas.microsoft.com/office/drawing/2016/ink" xmlns:am3d="http://schemas.microsoft.com/office/drawing/2017/model3d" xmlns:o="urn:schemas-microsoft-com:office:office" xmlns:oel="http://schemas.microsoft.com/office/2019/extlst" xmlns:r="http://schemas.openxmlformats.org/officeDocument/2006/relationships" xmlns:m="http://schemas.openxmlformats.org/officeDocument/2006/math" xmlns:v="urn:schemas-microsoft-com:vml" xmlns:wp14="http://schemas.microsoft.com/office/word/2010/wordprocessingDrawing" xmlns:wp="http://schemas.openxmlformats.org/drawingml/2006/wordprocessingDrawing" xmlns:w10="urn:schemas-microsoft-com:office:word" xmlns:w="http://schemas.openxmlformats.org/wordprocessingml/2006/main" xmlns:w14="http://schemas.microsoft.com/office/word/2010/wordml" xmlns:w15="http://schemas.microsoft.com/office/word/2012/wordml" xmlns:w16cex="http://schemas.microsoft.com/office/word/2018/wordml/cex" xmlns:w16cid="http://schemas.microsoft.com/office/word/2016/wordml/cid" xmlns:w16="http://schemas.microsoft.com/office/word/2018/wordml" xmlns:w16du="http://schemas.microsoft.com/office/word/2023/wordml/word16du" xmlns:w16sdtdh="http://schemas.microsoft.com/office/word/2020/wordml/sdtdatahash" xmlns:w16sdtfl="http://schemas.microsoft.com/office/word/2024/wordml/sdtformatlock" xmlns:w16se="http://schemas.microsoft.com/office/word/2015/wordml/symex" xmlns:wpg="http://schemas.microsoft.com/office/word/2010/wordprocessingGroup" xmlns:wpi="http://schemas.microsoft.com/office/word/2010/wordprocessingInk" xmlns:wne="http://schemas.microsoft.com/office/word/2006/wordml" xmlns:wps="http://schemas.microsoft.com/office/word/2010/wordprocessingShape" mc:Ignorable="w14 w15 w16se w16cid w16 w16cex w16sdtdh w16sdtfl w16du wp14">
   <w:endnote w:type="separator" w:id="-1">
     <w:p>
       <w:r>
@@ -24076,7 +24330,7 @@
 </file>
 
 <file path=word/footnotes.xml><?xml version="1.0" encoding="utf-8"?>
-<w:footnotes xmlns:wpc="http://schemas.microsoft.com/office/word/2010/wordprocessingCanvas" xmlns:cx="http://schemas.microsoft.com/office/drawing/2014/chartex" xmlns:cx1="http://schemas.microsoft.com/office/drawing/2015/9/8/chartex" xmlns:cx2="http://schemas.microsoft.com/office/drawing/2015/10/21/chartex" xmlns:cx3="http://schemas.microsoft.com/office/drawing/2016/5/9/chartex" xmlns:cx4="http://schemas.microsoft.com/office/drawing/2016/5/10/chartex" xmlns:cx5="http://schemas.microsoft.com/office/drawing/2016/5/11/chartex" xmlns:cx6="http://schemas.microsoft.com/office/drawing/2016/5/12/chartex" xmlns:cx7="http://schemas.microsoft.com/office/drawing/2016/5/13/chartex" xmlns:cx8="http://schemas.microsoft.com/office/drawing/2016/5/14/chartex" xmlns:mc="http://schemas.openxmlformats.org/markup-compatibility/2006" xmlns:aink="http://schemas.microsoft.com/office/drawing/2016/ink" xmlns:am3d="http://schemas.microsoft.com/office/drawing/2017/model3d" xmlns:o="urn:schemas-microsoft-com:office:office" xmlns:r="http://schemas.openxmlformats.org/officeDocument/2006/relationships" xmlns:m="http://schemas.openxmlformats.org/officeDocument/2006/math" xmlns:v="urn:schemas-microsoft-com:vml" xmlns:wp14="http://schemas.microsoft.com/office/word/2010/wordprocessingDrawing" xmlns:wp="http://schemas.openxmlformats.org/drawingml/2006/wordprocessingDrawing" xmlns:w10="urn:schemas-microsoft-com:office:word" xmlns:w="http://schemas.openxmlformats.org/wordprocessingml/2006/main" xmlns:w14="http://schemas.microsoft.com/office/word/2010/wordml" xmlns:w15="http://schemas.microsoft.com/office/word/2012/wordml" xmlns:w16cex="http://schemas.microsoft.com/office/word/2018/wordml/cex" xmlns:w16cid="http://schemas.microsoft.com/office/word/2016/wordml/cid" xmlns:w16="http://schemas.microsoft.com/office/word/2018/wordml" xmlns:w16se="http://schemas.microsoft.com/office/word/2015/wordml/symex" xmlns:wpg="http://schemas.microsoft.com/office/word/2010/wordprocessingGroup" xmlns:wpi="http://schemas.microsoft.com/office/word/2010/wordprocessingInk" xmlns:wne="http://schemas.microsoft.com/office/word/2006/wordml" xmlns:wps="http://schemas.microsoft.com/office/word/2010/wordprocessingShape" mc:Ignorable="w14 w15 w16se w16cid w16 w16cex wp14">
+<w:footnotes xmlns:wpc="http://schemas.microsoft.com/office/word/2010/wordprocessingCanvas" xmlns:cx="http://schemas.microsoft.com/office/drawing/2014/chartex" xmlns:cx1="http://schemas.microsoft.com/office/drawing/2015/9/8/chartex" xmlns:cx2="http://schemas.microsoft.com/office/drawing/2015/10/21/chartex" xmlns:cx3="http://schemas.microsoft.com/office/drawing/2016/5/9/chartex" xmlns:cx4="http://schemas.microsoft.com/office/drawing/2016/5/10/chartex" xmlns:cx5="http://schemas.microsoft.com/office/drawing/2016/5/11/chartex" xmlns:cx6="http://schemas.microsoft.com/office/drawing/2016/5/12/chartex" xmlns:cx7="http://schemas.microsoft.com/office/drawing/2016/5/13/chartex" xmlns:cx8="http://schemas.microsoft.com/office/drawing/2016/5/14/chartex" xmlns:mc="http://schemas.openxmlformats.org/markup-compatibility/2006" xmlns:aink="http://schemas.microsoft.com/office/drawing/2016/ink" xmlns:am3d="http://schemas.microsoft.com/office/drawing/2017/model3d" xmlns:o="urn:schemas-microsoft-com:office:office" xmlns:oel="http://schemas.microsoft.com/office/2019/extlst" xmlns:r="http://schemas.openxmlformats.org/officeDocument/2006/relationships" xmlns:m="http://schemas.openxmlformats.org/officeDocument/2006/math" xmlns:v="urn:schemas-microsoft-com:vml" xmlns:wp14="http://schemas.microsoft.com/office/word/2010/wordprocessingDrawing" xmlns:wp="http://schemas.openxmlformats.org/drawingml/2006/wordprocessingDrawing" xmlns:w10="urn:schemas-microsoft-com:office:word" xmlns:w="http://schemas.openxmlformats.org/wordprocessingml/2006/main" xmlns:w14="http://schemas.microsoft.com/office/word/2010/wordml" xmlns:w15="http://schemas.microsoft.com/office/word/2012/wordml" xmlns:w16cex="http://schemas.microsoft.com/office/word/2018/wordml/cex" xmlns:w16cid="http://schemas.microsoft.com/office/word/2016/wordml/cid" xmlns:w16="http://schemas.microsoft.com/office/word/2018/wordml" xmlns:w16du="http://schemas.microsoft.com/office/word/2023/wordml/word16du" xmlns:w16sdtdh="http://schemas.microsoft.com/office/word/2020/wordml/sdtdatahash" xmlns:w16sdtfl="http://schemas.microsoft.com/office/word/2024/wordml/sdtformatlock" xmlns:w16se="http://schemas.microsoft.com/office/word/2015/wordml/symex" xmlns:wpg="http://schemas.microsoft.com/office/word/2010/wordprocessingGroup" xmlns:wpi="http://schemas.microsoft.com/office/word/2010/wordprocessingInk" xmlns:wne="http://schemas.microsoft.com/office/word/2006/wordml" xmlns:wps="http://schemas.microsoft.com/office/word/2010/wordprocessingShape" mc:Ignorable="w14 w15 w16se w16cid w16 w16cex w16sdtdh w16sdtfl w16du wp14">
   <w:footnote w:type="separator" w:id="-1">
     <w:p>
       <w:r>
@@ -24095,7 +24349,7 @@
 </file>
 
 <file path=word/numbering.xml><?xml version="1.0" encoding="utf-8"?>
-<w:numbering xmlns:wpc="http://schemas.microsoft.com/office/word/2010/wordprocessingCanvas" xmlns:cx="http://schemas.microsoft.com/office/drawing/2014/chartex" xmlns:cx1="http://schemas.microsoft.com/office/drawing/2015/9/8/chartex" xmlns:cx2="http://schemas.microsoft.com/office/drawing/2015/10/21/chartex" xmlns:cx3="http://schemas.microsoft.com/office/drawing/2016/5/9/chartex" xmlns:cx4="http://schemas.microsoft.com/office/drawing/2016/5/10/chartex" xmlns:cx5="http://schemas.microsoft.com/office/drawing/2016/5/11/chartex" xmlns:cx6="http://schemas.microsoft.com/office/drawing/2016/5/12/chartex" xmlns:cx7="http://schemas.microsoft.com/office/drawing/2016/5/13/chartex" xmlns:cx8="http://schemas.microsoft.com/office/drawing/2016/5/14/chartex" xmlns:mc="http://schemas.openxmlformats.org/markup-compatibility/2006" xmlns:aink="http://schemas.microsoft.com/office/drawing/2016/ink" xmlns:am3d="http://schemas.microsoft.com/office/drawing/2017/model3d" xmlns:o="urn:schemas-microsoft-com:office:office" xmlns:r="http://schemas.openxmlformats.org/officeDocument/2006/relationships" xmlns:m="http://schemas.openxmlformats.org/officeDocument/2006/math" xmlns:v="urn:schemas-microsoft-com:vml" xmlns:wp14="http://schemas.microsoft.com/office/word/2010/wordprocessingDrawing" xmlns:wp="http://schemas.openxmlformats.org/drawingml/2006/wordprocessingDrawing" xmlns:w10="urn:schemas-microsoft-com:office:word" xmlns:w="http://schemas.openxmlformats.org/wordprocessingml/2006/main" xmlns:w14="http://schemas.microsoft.com/office/word/2010/wordml" xmlns:w15="http://schemas.microsoft.com/office/word/2012/wordml" xmlns:w16cex="http://schemas.microsoft.com/office/word/2018/wordml/cex" xmlns:w16cid="http://schemas.microsoft.com/office/word/2016/wordml/cid" xmlns:w16="http://schemas.microsoft.com/office/word/2018/wordml" xmlns:w16se="http://schemas.microsoft.com/office/word/2015/wordml/symex" xmlns:wpg="http://schemas.microsoft.com/office/word/2010/wordprocessingGroup" xmlns:wpi="http://schemas.microsoft.com/office/word/2010/wordprocessingInk" xmlns:wne="http://schemas.microsoft.com/office/word/2006/wordml" xmlns:wps="http://schemas.microsoft.com/office/word/2010/wordprocessingShape" mc:Ignorable="w14 w15 w16se w16cid w16 w16cex wp14">
+<w:numbering xmlns:wpc="http://schemas.microsoft.com/office/word/2010/wordprocessingCanvas" xmlns:cx="http://schemas.microsoft.com/office/drawing/2014/chartex" xmlns:cx1="http://schemas.microsoft.com/office/drawing/2015/9/8/chartex" xmlns:cx2="http://schemas.microsoft.com/office/drawing/2015/10/21/chartex" xmlns:cx3="http://schemas.microsoft.com/office/drawing/2016/5/9/chartex" xmlns:cx4="http://schemas.microsoft.com/office/drawing/2016/5/10/chartex" xmlns:cx5="http://schemas.microsoft.com/office/drawing/2016/5/11/chartex" xmlns:cx6="http://schemas.microsoft.com/office/drawing/2016/5/12/chartex" xmlns:cx7="http://schemas.microsoft.com/office/drawing/2016/5/13/chartex" xmlns:cx8="http://schemas.microsoft.com/office/drawing/2016/5/14/chartex" xmlns:mc="http://schemas.openxmlformats.org/markup-compatibility/2006" xmlns:aink="http://schemas.microsoft.com/office/drawing/2016/ink" xmlns:am3d="http://schemas.microsoft.com/office/drawing/2017/model3d" xmlns:o="urn:schemas-microsoft-com:office:office" xmlns:oel="http://schemas.microsoft.com/office/2019/extlst" xmlns:r="http://schemas.openxmlformats.org/officeDocument/2006/relationships" xmlns:m="http://schemas.openxmlformats.org/officeDocument/2006/math" xmlns:v="urn:schemas-microsoft-com:vml" xmlns:wp14="http://schemas.microsoft.com/office/word/2010/wordprocessingDrawing" xmlns:wp="http://schemas.openxmlformats.org/drawingml/2006/wordprocessingDrawing" xmlns:w10="urn:schemas-microsoft-com:office:word" xmlns:w="http://schemas.openxmlformats.org/wordprocessingml/2006/main" xmlns:w14="http://schemas.microsoft.com/office/word/2010/wordml" xmlns:w15="http://schemas.microsoft.com/office/word/2012/wordml" xmlns:w16cex="http://schemas.microsoft.com/office/word/2018/wordml/cex" xmlns:w16cid="http://schemas.microsoft.com/office/word/2016/wordml/cid" xmlns:w16="http://schemas.microsoft.com/office/word/2018/wordml" xmlns:w16du="http://schemas.microsoft.com/office/word/2023/wordml/word16du" xmlns:w16sdtdh="http://schemas.microsoft.com/office/word/2020/wordml/sdtdatahash" xmlns:w16sdtfl="http://schemas.microsoft.com/office/word/2024/wordml/sdtformatlock" xmlns:w16se="http://schemas.microsoft.com/office/word/2015/wordml/symex" xmlns:wpg="http://schemas.microsoft.com/office/word/2010/wordprocessingGroup" xmlns:wpi="http://schemas.microsoft.com/office/word/2010/wordprocessingInk" xmlns:wne="http://schemas.microsoft.com/office/word/2006/wordml" xmlns:wps="http://schemas.microsoft.com/office/word/2010/wordprocessingShape" mc:Ignorable="w14 w15 w16se w16cid w16 w16cex w16sdtdh w16sdtfl w16du wp14">
   <w:abstractNum w:abstractNumId="0" w15:restartNumberingAfterBreak="0">
     <w:nsid w:val="020D4CB2"/>
     <w:multiLevelType w:val="multilevel"/>
@@ -25258,44 +25512,44 @@
       </w:rPr>
     </w:lvl>
   </w:abstractNum>
-  <w:num w:numId="1">
+  <w:num w:numId="1" w16cid:durableId="1078820388">
     <w:abstractNumId w:val="9"/>
   </w:num>
-  <w:num w:numId="2">
+  <w:num w:numId="2" w16cid:durableId="1075125750">
     <w:abstractNumId w:val="2"/>
   </w:num>
-  <w:num w:numId="3">
+  <w:num w:numId="3" w16cid:durableId="1662126120">
     <w:abstractNumId w:val="3"/>
   </w:num>
-  <w:num w:numId="4">
+  <w:num w:numId="4" w16cid:durableId="465045809">
     <w:abstractNumId w:val="5"/>
   </w:num>
-  <w:num w:numId="5">
+  <w:num w:numId="5" w16cid:durableId="269091556">
     <w:abstractNumId w:val="10"/>
   </w:num>
-  <w:num w:numId="6">
+  <w:num w:numId="6" w16cid:durableId="1169827118">
     <w:abstractNumId w:val="6"/>
   </w:num>
-  <w:num w:numId="7">
+  <w:num w:numId="7" w16cid:durableId="1216433008">
     <w:abstractNumId w:val="7"/>
   </w:num>
-  <w:num w:numId="8">
+  <w:num w:numId="8" w16cid:durableId="15275514">
     <w:abstractNumId w:val="8"/>
   </w:num>
-  <w:num w:numId="9">
+  <w:num w:numId="9" w16cid:durableId="2048290136">
     <w:abstractNumId w:val="1"/>
   </w:num>
-  <w:num w:numId="10">
+  <w:num w:numId="10" w16cid:durableId="1723557084">
     <w:abstractNumId w:val="0"/>
   </w:num>
-  <w:num w:numId="11">
+  <w:num w:numId="11" w16cid:durableId="2063599966">
     <w:abstractNumId w:val="4"/>
   </w:num>
 </w:numbering>
 </file>
 
 <file path=word/styles.xml><?xml version="1.0" encoding="utf-8"?>
-<w:styles xmlns:mc="http://schemas.openxmlformats.org/markup-compatibility/2006" xmlns:r="http://schemas.openxmlformats.org/officeDocument/2006/relationships" xmlns:w="http://schemas.openxmlformats.org/wordprocessingml/2006/main" xmlns:w14="http://schemas.microsoft.com/office/word/2010/wordml" xmlns:w15="http://schemas.microsoft.com/office/word/2012/wordml" xmlns:w16cex="http://schemas.microsoft.com/office/word/2018/wordml/cex" xmlns:w16cid="http://schemas.microsoft.com/office/word/2016/wordml/cid" xmlns:w16="http://schemas.microsoft.com/office/word/2018/wordml" xmlns:w16se="http://schemas.microsoft.com/office/word/2015/wordml/symex" mc:Ignorable="w14 w15 w16se w16cid w16 w16cex">
+<w:styles xmlns:mc="http://schemas.openxmlformats.org/markup-compatibility/2006" xmlns:r="http://schemas.openxmlformats.org/officeDocument/2006/relationships" xmlns:w="http://schemas.openxmlformats.org/wordprocessingml/2006/main" xmlns:w14="http://schemas.microsoft.com/office/word/2010/wordml" xmlns:w15="http://schemas.microsoft.com/office/word/2012/wordml" xmlns:w16cex="http://schemas.microsoft.com/office/word/2018/wordml/cex" xmlns:w16cid="http://schemas.microsoft.com/office/word/2016/wordml/cid" xmlns:w16="http://schemas.microsoft.com/office/word/2018/wordml" xmlns:w16du="http://schemas.microsoft.com/office/word/2023/wordml/word16du" xmlns:w16sdtdh="http://schemas.microsoft.com/office/word/2020/wordml/sdtdatahash" xmlns:w16sdtfl="http://schemas.microsoft.com/office/word/2024/wordml/sdtformatlock" xmlns:w16se="http://schemas.microsoft.com/office/word/2015/wordml/symex" mc:Ignorable="w14 w15 w16se w16cid w16 w16cex w16sdtdh w16sdtfl w16du">
   <w:docDefaults>
     <w:rPrDefault>
       <w:rPr>
@@ -25694,7 +25948,7 @@
   <w:style w:type="paragraph" w:default="1" w:styleId="a">
     <w:name w:val="Normal"/>
     <w:qFormat/>
-    <w:rsid w:val="003D4C24"/>
+    <w:rsid w:val="003B24C0"/>
     <w:pPr>
       <w:spacing w:after="0" w:line="240" w:lineRule="auto"/>
       <w:ind w:firstLine="709"/>
@@ -25703,7 +25957,7 @@
     <w:rPr>
       <w:rFonts w:ascii="Times New Roman" w:eastAsia="Times New Roman" w:hAnsi="Times New Roman" w:cs="Times New Roman"/>
       <w:kern w:val="0"/>
-      <w:sz w:val="28"/>
+      <w:sz w:val="24"/>
       <w:szCs w:val="28"/>
       <w:lang w:eastAsia="ru-RU"/>
       <w14:ligatures w14:val="none"/>
@@ -25716,7 +25970,7 @@
     <w:link w:val="10"/>
     <w:uiPriority w:val="9"/>
     <w:qFormat/>
-    <w:rsid w:val="00213B5B"/>
+    <w:rsid w:val="003B24C0"/>
     <w:pPr>
       <w:keepNext/>
       <w:keepLines/>
@@ -25728,7 +25982,6 @@
     <w:rPr>
       <w:b/>
       <w:bCs/>
-      <w:sz w:val="36"/>
     </w:rPr>
   </w:style>
   <w:style w:type="paragraph" w:styleId="2">
@@ -25934,13 +26187,13 @@
     <w:basedOn w:val="a0"/>
     <w:link w:val="1"/>
     <w:uiPriority w:val="9"/>
-    <w:rsid w:val="00213B5B"/>
+    <w:rsid w:val="003B24C0"/>
     <w:rPr>
       <w:rFonts w:ascii="Times New Roman" w:eastAsia="Times New Roman" w:hAnsi="Times New Roman" w:cs="Times New Roman"/>
       <w:b/>
       <w:bCs/>
       <w:kern w:val="0"/>
-      <w:sz w:val="36"/>
+      <w:sz w:val="28"/>
       <w:szCs w:val="28"/>
       <w:lang w:eastAsia="ru-RU"/>
       <w14:ligatures w14:val="none"/>
@@ -26333,7 +26586,6 @@
     <w:unhideWhenUsed/>
     <w:rsid w:val="00D9720D"/>
     <w:rPr>
-      <w:sz w:val="24"/>
       <w:szCs w:val="24"/>
     </w:rPr>
   </w:style>

</xml_diff>